<commit_message>
31 st july all complete func doc
</commit_message>
<xml_diff>
--- a/docs/ARCHITECTURE.docx
+++ b/docs/ARCHITECTURE.docx
@@ -10,7 +10,7 @@
         <w:t xml:space="preserve">ARCHITECTURE</w:t>
       </w:r>
     </w:p>
-    <w:bookmarkStart w:id="21" w:name="architecture"/>
+    <w:bookmarkStart w:id="22" w:name="architecture"/>
     <w:p>
       <w:pPr>
         <w:pStyle w:val="Heading1"/>
@@ -19,7 +19,7 @@
         <w:t xml:space="preserve">Architecture</w:t>
       </w:r>
     </w:p>
-    <w:bookmarkStart w:id="10" w:name="overview"/>
+    <w:bookmarkStart w:id="11" w:name="overview"/>
     <w:p>
       <w:pPr>
         <w:pStyle w:val="Heading2"/>
@@ -31,11 +31,25 @@
     <w:p>
       <w:pPr>
         <w:pStyle w:val="FirstParagraph"/>
-        <w:spacing w:after="160" w:line="276" w:lineRule="auto"/>
-        <w:jc w:val="left"/>
       </w:pPr>
       <w:r>
-        <w:t xml:space="preserve">BankOne is a staff-facing core banking shell.</w:t>
+        <w:t xml:space="preserve">BankOne is a</w:t>
+      </w:r>
+      <w:r>
+        <w:t xml:space="preserve"> </w:t>
+      </w:r>
+      <w:r>
+        <w:rPr>
+          <w:b/>
+          <w:bCs/>
+        </w:rPr>
+        <w:t xml:space="preserve">staff + customer-portal</w:t>
+      </w:r>
+      <w:r>
+        <w:t xml:space="preserve"> </w:t>
+      </w:r>
+      <w:r>
+        <w:t xml:space="preserve">core banking shell.</w:t>
       </w:r>
     </w:p>
     <w:p>
@@ -84,8 +98,6 @@
           <w:ilvl w:val="0"/>
           <w:numId w:val="1001"/>
         </w:numPr>
-        <w:spacing w:after="160" w:line="276" w:lineRule="auto"/>
-        <w:jc w:val="left"/>
       </w:pPr>
       <w:r>
         <w:rPr>
@@ -118,8 +130,6 @@
           <w:ilvl w:val="0"/>
           <w:numId w:val="1001"/>
         </w:numPr>
-        <w:spacing w:after="160" w:line="276" w:lineRule="auto"/>
-        <w:jc w:val="left"/>
       </w:pPr>
       <w:r>
         <w:rPr>
@@ -132,7 +142,31 @@
         <w:t xml:space="preserve"> </w:t>
       </w:r>
       <w:r>
-        <w:t xml:space="preserve">Angular SPA with JWT Bearer auth</w:t>
+        <w:t xml:space="preserve">Angular SPA with JWT Bearer auth (staff</w:t>
+      </w:r>
+      <w:r>
+        <w:t xml:space="preserve"> </w:t>
+      </w:r>
+      <w:r>
+        <w:rPr>
+          <w:rStyle w:val="VerbatimChar"/>
+        </w:rPr>
+        <w:t xml:space="preserve">/app/*</w:t>
+      </w:r>
+      <w:r>
+        <w:t xml:space="preserve">, portal</w:t>
+      </w:r>
+      <w:r>
+        <w:t xml:space="preserve"> </w:t>
+      </w:r>
+      <w:r>
+        <w:rPr>
+          <w:rStyle w:val="VerbatimChar"/>
+        </w:rPr>
+        <w:t xml:space="preserve">/portal/*</w:t>
+      </w:r>
+      <w:r>
+        <w:t xml:space="preserve">)</w:t>
       </w:r>
     </w:p>
     <w:p>
@@ -142,8 +176,6 @@
           <w:ilvl w:val="0"/>
           <w:numId w:val="1001"/>
         </w:numPr>
-        <w:spacing w:after="160" w:line="276" w:lineRule="auto"/>
-        <w:jc w:val="left"/>
       </w:pPr>
       <w:r>
         <w:rPr>
@@ -175,8 +207,6 @@
           <w:ilvl w:val="0"/>
           <w:numId w:val="1001"/>
         </w:numPr>
-        <w:spacing w:after="160" w:line="276" w:lineRule="auto"/>
-        <w:jc w:val="left"/>
       </w:pPr>
       <w:r>
         <w:rPr>
@@ -216,8 +246,6 @@
     <w:p>
       <w:pPr>
         <w:pStyle w:val="FirstParagraph"/>
-        <w:spacing w:after="160" w:line="276" w:lineRule="auto"/>
-        <w:jc w:val="left"/>
       </w:pPr>
       <w:r>
         <w:t xml:space="preserve">Full technology and version inventory:</w:t>
@@ -239,68 +267,24 @@
     </w:p>
     <w:p>
       <w:pPr>
-        <w:pStyle w:val="SourceCode"/>
+        <w:pStyle w:val="BodyText"/>
       </w:pPr>
       <w:r>
-        <w:rPr>
-          <w:rStyle w:val="VerbatimChar"/>
-        </w:rPr>
-        <w:t xml:space="preserve">flowchart LR</w:t>
-      </w:r>
-      <w:r>
-        <w:br/>
-      </w:r>
-      <w:r>
-        <w:rPr>
-          <w:rStyle w:val="VerbatimChar"/>
-        </w:rPr>
-        <w:t xml:space="preserve">  UI[Angular SPA :4200] --&gt;|HTTPS/HTTP JWT| API[Spring Boot on Liberty :9080]</w:t>
-      </w:r>
-      <w:r>
-        <w:br/>
-      </w:r>
-      <w:r>
-        <w:rPr>
-          <w:rStyle w:val="VerbatimChar"/>
-        </w:rPr>
-        <w:t xml:space="preserve">  API --&gt; PG[(PostgreSQL :5432)]</w:t>
-      </w:r>
-      <w:r>
-        <w:br/>
-      </w:r>
-      <w:r>
-        <w:rPr>
-          <w:rStyle w:val="VerbatimChar"/>
-        </w:rPr>
-        <w:t xml:space="preserve">  API --&gt;|publish BankActionEvent| Kafka[Kafka]</w:t>
-      </w:r>
-      <w:r>
-        <w:br/>
-      </w:r>
-      <w:r>
-        <w:rPr>
-          <w:rStyle w:val="VerbatimChar"/>
-        </w:rPr>
-        <w:t xml:space="preserve">  Kafka --&gt; Consumer[NotificationConsumer]</w:t>
-      </w:r>
-      <w:r>
-        <w:br/>
-      </w:r>
-      <w:r>
-        <w:rPr>
-          <w:rStyle w:val="VerbatimChar"/>
-        </w:rPr>
-        <w:t xml:space="preserve">  Consumer --&gt; Mail[Mailpit or SendGrid]</w:t>
-      </w:r>
-    </w:p>
-    <w:bookmarkEnd w:id="10"/>
-    <w:bookmarkStart w:id="11" w:name="package-dependencies"/>
-    <w:p>
-      <w:pPr>
-        <w:pStyle w:val="Heading2"/>
-      </w:pPr>
-      <w:r>
-        <w:t xml:space="preserve">Package dependencies</w:t>
+        <w:t xml:space="preserve">Learning / platform roadmap (rate limit, cache, outbox, sharding lab):</w:t>
+      </w:r>
+      <w:r>
+        <w:t xml:space="preserve"> </w:t>
+      </w:r>
+      <w:hyperlink r:id="rId10">
+        <w:r>
+          <w:rPr>
+            <w:rStyle w:val="Hyperlink"/>
+          </w:rPr>
+          <w:t xml:space="preserve">TECH_LEARNING_PLAN.md</w:t>
+        </w:r>
+      </w:hyperlink>
+      <w:r>
+        <w:t xml:space="preserve">.</w:t>
       </w:r>
     </w:p>
     <w:p>
@@ -311,7 +295,7 @@
         <w:rPr>
           <w:rStyle w:val="VerbatimChar"/>
         </w:rPr>
-        <w:t xml:space="preserve">flowchart TB</w:t>
+        <w:t xml:space="preserve">flowchart LR</w:t>
       </w:r>
       <w:r>
         <w:br/>
@@ -320,7 +304,7 @@
         <w:rPr>
           <w:rStyle w:val="VerbatimChar"/>
         </w:rPr>
-        <w:t xml:space="preserve">  subgraph backend [com.bankone]</w:t>
+        <w:t xml:space="preserve">  UI[Angular SPA :4200] --&gt;|HTTPS/HTTP JWT| API[Spring Boot on Liberty :9080]</w:t>
       </w:r>
       <w:r>
         <w:br/>
@@ -329,7 +313,7 @@
         <w:rPr>
           <w:rStyle w:val="VerbatimChar"/>
         </w:rPr>
-        <w:t xml:space="preserve">    auth[auth]</w:t>
+        <w:t xml:space="preserve">  API --&gt; PG[(PostgreSQL :5432)]</w:t>
       </w:r>
       <w:r>
         <w:br/>
@@ -338,7 +322,7 @@
         <w:rPr>
           <w:rStyle w:val="VerbatimChar"/>
         </w:rPr>
-        <w:t xml:space="preserve">    user[user]</w:t>
+        <w:t xml:space="preserve">  API --&gt;|publish BankActionEvent| Kafka[Kafka]</w:t>
       </w:r>
       <w:r>
         <w:br/>
@@ -347,7 +331,7 @@
         <w:rPr>
           <w:rStyle w:val="VerbatimChar"/>
         </w:rPr>
-        <w:t xml:space="preserve">    role[role]</w:t>
+        <w:t xml:space="preserve">  Kafka --&gt; Consumer[NotificationConsumer]</w:t>
       </w:r>
       <w:r>
         <w:br/>
@@ -356,246 +340,17 @@
         <w:rPr>
           <w:rStyle w:val="VerbatimChar"/>
         </w:rPr>
-        <w:t xml:space="preserve">    customer[customer]</w:t>
-      </w:r>
-      <w:r>
-        <w:br/>
-      </w:r>
-      <w:r>
-        <w:rPr>
-          <w:rStyle w:val="VerbatimChar"/>
-        </w:rPr>
-        <w:t xml:space="preserve">    account[account]</w:t>
-      </w:r>
-      <w:r>
-        <w:br/>
-      </w:r>
-      <w:r>
-        <w:rPr>
-          <w:rStyle w:val="VerbatimChar"/>
-        </w:rPr>
-        <w:t xml:space="preserve">    notification[notification]</w:t>
-      </w:r>
-      <w:r>
-        <w:br/>
-      </w:r>
-      <w:r>
-        <w:rPr>
-          <w:rStyle w:val="VerbatimChar"/>
-        </w:rPr>
-        <w:t xml:space="preserve">    dashboard[dashboard]</w:t>
-      </w:r>
-      <w:r>
-        <w:br/>
-      </w:r>
-      <w:r>
-        <w:rPr>
-          <w:rStyle w:val="VerbatimChar"/>
-        </w:rPr>
-        <w:t xml:space="preserve">    common[common]</w:t>
-      </w:r>
-      <w:r>
-        <w:br/>
-      </w:r>
-      <w:r>
-        <w:rPr>
-          <w:rStyle w:val="VerbatimChar"/>
-        </w:rPr>
-        <w:t xml:space="preserve">  end</w:t>
-      </w:r>
-      <w:r>
-        <w:br/>
-      </w:r>
-      <w:r>
-        <w:rPr>
-          <w:rStyle w:val="VerbatimChar"/>
-        </w:rPr>
-        <w:t xml:space="preserve">  auth --&gt; user</w:t>
-      </w:r>
-      <w:r>
-        <w:br/>
-      </w:r>
-      <w:r>
-        <w:rPr>
-          <w:rStyle w:val="VerbatimChar"/>
-        </w:rPr>
-        <w:t xml:space="preserve">  auth --&gt; role</w:t>
-      </w:r>
-      <w:r>
-        <w:br/>
-      </w:r>
-      <w:r>
-        <w:rPr>
-          <w:rStyle w:val="VerbatimChar"/>
-        </w:rPr>
-        <w:t xml:space="preserve">  auth --&gt; common</w:t>
-      </w:r>
-      <w:r>
-        <w:br/>
-      </w:r>
-      <w:r>
-        <w:rPr>
-          <w:rStyle w:val="VerbatimChar"/>
-        </w:rPr>
-        <w:t xml:space="preserve">  customer --&gt; account</w:t>
-      </w:r>
-      <w:r>
-        <w:br/>
-      </w:r>
-      <w:r>
-        <w:rPr>
-          <w:rStyle w:val="VerbatimChar"/>
-        </w:rPr>
-        <w:t xml:space="preserve">  account --&gt; customer</w:t>
-      </w:r>
-      <w:r>
-        <w:br/>
-      </w:r>
-      <w:r>
-        <w:rPr>
-          <w:rStyle w:val="VerbatimChar"/>
-        </w:rPr>
-        <w:t xml:space="preserve">  account --&gt; common</w:t>
-      </w:r>
-      <w:r>
-        <w:br/>
-      </w:r>
-      <w:r>
-        <w:rPr>
-          <w:rStyle w:val="VerbatimChar"/>
-        </w:rPr>
-        <w:t xml:space="preserve">  account --&gt; notification</w:t>
-      </w:r>
-      <w:r>
-        <w:br/>
-      </w:r>
-      <w:r>
-        <w:rPr>
-          <w:rStyle w:val="VerbatimChar"/>
-        </w:rPr>
-        <w:t xml:space="preserve">  user --&gt; role</w:t>
-      </w:r>
-      <w:r>
-        <w:br/>
-      </w:r>
-      <w:r>
-        <w:rPr>
-          <w:rStyle w:val="VerbatimChar"/>
-        </w:rPr>
-        <w:t xml:space="preserve">  user --&gt; common</w:t>
-      </w:r>
-      <w:r>
-        <w:br/>
-      </w:r>
-      <w:r>
-        <w:rPr>
-          <w:rStyle w:val="VerbatimChar"/>
-        </w:rPr>
-        <w:t xml:space="preserve">  dashboard --&gt; customer</w:t>
-      </w:r>
-      <w:r>
-        <w:br/>
-      </w:r>
-      <w:r>
-        <w:rPr>
-          <w:rStyle w:val="VerbatimChar"/>
-        </w:rPr>
-        <w:t xml:space="preserve">  dashboard --&gt; account</w:t>
-      </w:r>
-      <w:r>
-        <w:br/>
-      </w:r>
-      <w:r>
-        <w:rPr>
-          <w:rStyle w:val="VerbatimChar"/>
-        </w:rPr>
-        <w:t xml:space="preserve">  dashboard --&gt; user</w:t>
-      </w:r>
-    </w:p>
-    <w:p>
-      <w:pPr>
-        <w:pStyle w:val="FirstParagraph"/>
-        <w:spacing w:after="160" w:line="276" w:lineRule="auto"/>
-        <w:jc w:val="left"/>
-      </w:pPr>
-      <w:r>
-        <w:t xml:space="preserve">Implemented packages include</w:t>
-      </w:r>
-      <w:r>
-        <w:t xml:space="preserve"> </w:t>
-      </w:r>
-      <w:r>
-        <w:rPr>
-          <w:rStyle w:val="VerbatimChar"/>
-        </w:rPr>
-        <w:t xml:space="preserve">transaction</w:t>
-      </w:r>
-      <w:r>
-        <w:t xml:space="preserve"> </w:t>
-      </w:r>
-      <w:r>
-        <w:t xml:space="preserve">(ledger) and</w:t>
-      </w:r>
-      <w:r>
-        <w:t xml:space="preserve"> </w:t>
-      </w:r>
-      <w:r>
-        <w:rPr>
-          <w:rStyle w:val="VerbatimChar"/>
-        </w:rPr>
-        <w:t xml:space="preserve">notification</w:t>
-      </w:r>
-      <w:r>
-        <w:t xml:space="preserve"> </w:t>
-      </w:r>
-      <w:r>
-        <w:t xml:space="preserve">(Kafka → email). Placeholder / thin:</w:t>
-      </w:r>
-      <w:r>
-        <w:t xml:space="preserve"> </w:t>
-      </w:r>
-      <w:r>
-        <w:rPr>
-          <w:rStyle w:val="VerbatimChar"/>
-        </w:rPr>
-        <w:t xml:space="preserve">report</w:t>
-      </w:r>
-      <w:r>
-        <w:t xml:space="preserve">,</w:t>
-      </w:r>
-      <w:r>
-        <w:t xml:space="preserve"> </w:t>
-      </w:r>
-      <w:r>
-        <w:rPr>
-          <w:rStyle w:val="VerbatimChar"/>
-        </w:rPr>
-        <w:t xml:space="preserve">audit</w:t>
-      </w:r>
-      <w:r>
-        <w:t xml:space="preserve">,</w:t>
-      </w:r>
-      <w:r>
-        <w:t xml:space="preserve"> </w:t>
-      </w:r>
-      <w:r>
-        <w:rPr>
-          <w:rStyle w:val="VerbatimChar"/>
-        </w:rPr>
-        <w:t xml:space="preserve">beneficiary</w:t>
-      </w:r>
-      <w:r>
-        <w:t xml:space="preserve">.</w:t>
+        <w:t xml:space="preserve">  Consumer --&gt; Mail[Mailpit or SendGrid]</w:t>
       </w:r>
     </w:p>
     <w:bookmarkEnd w:id="11"/>
-    <w:bookmarkStart w:id="12" w:name="layering-per-feature-module"/>
+    <w:bookmarkStart w:id="12" w:name="package-dependencies"/>
     <w:p>
       <w:pPr>
         <w:pStyle w:val="Heading2"/>
       </w:pPr>
       <w:r>
-        <w:t xml:space="preserve">Layering (per feature module)</w:t>
+        <w:t xml:space="preserve">Package dependencies</w:t>
       </w:r>
     </w:p>
     <w:p>
@@ -606,6 +361,476 @@
         <w:rPr>
           <w:rStyle w:val="VerbatimChar"/>
         </w:rPr>
+        <w:t xml:space="preserve">flowchart TB</w:t>
+      </w:r>
+      <w:r>
+        <w:br/>
+      </w:r>
+      <w:r>
+        <w:rPr>
+          <w:rStyle w:val="VerbatimChar"/>
+        </w:rPr>
+        <w:t xml:space="preserve">  subgraph backend [com.bankone]</w:t>
+      </w:r>
+      <w:r>
+        <w:br/>
+      </w:r>
+      <w:r>
+        <w:rPr>
+          <w:rStyle w:val="VerbatimChar"/>
+        </w:rPr>
+        <w:t xml:space="preserve">    auth[auth]</w:t>
+      </w:r>
+      <w:r>
+        <w:br/>
+      </w:r>
+      <w:r>
+        <w:rPr>
+          <w:rStyle w:val="VerbatimChar"/>
+        </w:rPr>
+        <w:t xml:space="preserve">    user[user]</w:t>
+      </w:r>
+      <w:r>
+        <w:br/>
+      </w:r>
+      <w:r>
+        <w:rPr>
+          <w:rStyle w:val="VerbatimChar"/>
+        </w:rPr>
+        <w:t xml:space="preserve">    role[role]</w:t>
+      </w:r>
+      <w:r>
+        <w:br/>
+      </w:r>
+      <w:r>
+        <w:rPr>
+          <w:rStyle w:val="VerbatimChar"/>
+        </w:rPr>
+        <w:t xml:space="preserve">    customer[customer]</w:t>
+      </w:r>
+      <w:r>
+        <w:br/>
+      </w:r>
+      <w:r>
+        <w:rPr>
+          <w:rStyle w:val="VerbatimChar"/>
+        </w:rPr>
+        <w:t xml:space="preserve">    account[account]</w:t>
+      </w:r>
+      <w:r>
+        <w:br/>
+      </w:r>
+      <w:r>
+        <w:rPr>
+          <w:rStyle w:val="VerbatimChar"/>
+        </w:rPr>
+        <w:t xml:space="preserve">    transaction[transaction]</w:t>
+      </w:r>
+      <w:r>
+        <w:br/>
+      </w:r>
+      <w:r>
+        <w:rPr>
+          <w:rStyle w:val="VerbatimChar"/>
+        </w:rPr>
+        <w:t xml:space="preserve">    notification[notification]</w:t>
+      </w:r>
+      <w:r>
+        <w:br/>
+      </w:r>
+      <w:r>
+        <w:rPr>
+          <w:rStyle w:val="VerbatimChar"/>
+        </w:rPr>
+        <w:t xml:space="preserve">    portal[portal]</w:t>
+      </w:r>
+      <w:r>
+        <w:br/>
+      </w:r>
+      <w:r>
+        <w:rPr>
+          <w:rStyle w:val="VerbatimChar"/>
+        </w:rPr>
+        <w:t xml:space="preserve">    beneficiary[beneficiary]</w:t>
+      </w:r>
+      <w:r>
+        <w:br/>
+      </w:r>
+      <w:r>
+        <w:rPr>
+          <w:rStyle w:val="VerbatimChar"/>
+        </w:rPr>
+        <w:t xml:space="preserve">    transfer[transfer]</w:t>
+      </w:r>
+      <w:r>
+        <w:br/>
+      </w:r>
+      <w:r>
+        <w:rPr>
+          <w:rStyle w:val="VerbatimChar"/>
+        </w:rPr>
+        <w:t xml:space="preserve">    audit[audit]</w:t>
+      </w:r>
+      <w:r>
+        <w:br/>
+      </w:r>
+      <w:r>
+        <w:rPr>
+          <w:rStyle w:val="VerbatimChar"/>
+        </w:rPr>
+        <w:t xml:space="preserve">    report[report]</w:t>
+      </w:r>
+      <w:r>
+        <w:br/>
+      </w:r>
+      <w:r>
+        <w:rPr>
+          <w:rStyle w:val="VerbatimChar"/>
+        </w:rPr>
+        <w:t xml:space="preserve">    dashboard[dashboard]</w:t>
+      </w:r>
+      <w:r>
+        <w:br/>
+      </w:r>
+      <w:r>
+        <w:rPr>
+          <w:rStyle w:val="VerbatimChar"/>
+        </w:rPr>
+        <w:t xml:space="preserve">    common[common]</w:t>
+      </w:r>
+      <w:r>
+        <w:br/>
+      </w:r>
+      <w:r>
+        <w:rPr>
+          <w:rStyle w:val="VerbatimChar"/>
+        </w:rPr>
+        <w:t xml:space="preserve">  end</w:t>
+      </w:r>
+      <w:r>
+        <w:br/>
+      </w:r>
+      <w:r>
+        <w:rPr>
+          <w:rStyle w:val="VerbatimChar"/>
+        </w:rPr>
+        <w:t xml:space="preserve">  auth --&gt; user</w:t>
+      </w:r>
+      <w:r>
+        <w:br/>
+      </w:r>
+      <w:r>
+        <w:rPr>
+          <w:rStyle w:val="VerbatimChar"/>
+        </w:rPr>
+        <w:t xml:space="preserve">  auth --&gt; role</w:t>
+      </w:r>
+      <w:r>
+        <w:br/>
+      </w:r>
+      <w:r>
+        <w:rPr>
+          <w:rStyle w:val="VerbatimChar"/>
+        </w:rPr>
+        <w:t xml:space="preserve">  auth --&gt; audit</w:t>
+      </w:r>
+      <w:r>
+        <w:br/>
+      </w:r>
+      <w:r>
+        <w:rPr>
+          <w:rStyle w:val="VerbatimChar"/>
+        </w:rPr>
+        <w:t xml:space="preserve">  customer --&gt; account</w:t>
+      </w:r>
+      <w:r>
+        <w:br/>
+      </w:r>
+      <w:r>
+        <w:rPr>
+          <w:rStyle w:val="VerbatimChar"/>
+        </w:rPr>
+        <w:t xml:space="preserve">  account --&gt; customer</w:t>
+      </w:r>
+      <w:r>
+        <w:br/>
+      </w:r>
+      <w:r>
+        <w:rPr>
+          <w:rStyle w:val="VerbatimChar"/>
+        </w:rPr>
+        <w:t xml:space="preserve">  account --&gt; transaction</w:t>
+      </w:r>
+      <w:r>
+        <w:br/>
+      </w:r>
+      <w:r>
+        <w:rPr>
+          <w:rStyle w:val="VerbatimChar"/>
+        </w:rPr>
+        <w:t xml:space="preserve">  account --&gt; notification</w:t>
+      </w:r>
+      <w:r>
+        <w:br/>
+      </w:r>
+      <w:r>
+        <w:rPr>
+          <w:rStyle w:val="VerbatimChar"/>
+        </w:rPr>
+        <w:t xml:space="preserve">  account --&gt; audit</w:t>
+      </w:r>
+      <w:r>
+        <w:br/>
+      </w:r>
+      <w:r>
+        <w:rPr>
+          <w:rStyle w:val="VerbatimChar"/>
+        </w:rPr>
+        <w:t xml:space="preserve">  portal --&gt; account</w:t>
+      </w:r>
+      <w:r>
+        <w:br/>
+      </w:r>
+      <w:r>
+        <w:rPr>
+          <w:rStyle w:val="VerbatimChar"/>
+        </w:rPr>
+        <w:t xml:space="preserve">  portal --&gt; beneficiary</w:t>
+      </w:r>
+      <w:r>
+        <w:br/>
+      </w:r>
+      <w:r>
+        <w:rPr>
+          <w:rStyle w:val="VerbatimChar"/>
+        </w:rPr>
+        <w:t xml:space="preserve">  portal --&gt; transfer</w:t>
+      </w:r>
+      <w:r>
+        <w:br/>
+      </w:r>
+      <w:r>
+        <w:rPr>
+          <w:rStyle w:val="VerbatimChar"/>
+        </w:rPr>
+        <w:t xml:space="preserve">  transfer --&gt; account</w:t>
+      </w:r>
+      <w:r>
+        <w:br/>
+      </w:r>
+      <w:r>
+        <w:rPr>
+          <w:rStyle w:val="VerbatimChar"/>
+        </w:rPr>
+        <w:t xml:space="preserve">  transfer --&gt; audit</w:t>
+      </w:r>
+      <w:r>
+        <w:br/>
+      </w:r>
+      <w:r>
+        <w:rPr>
+          <w:rStyle w:val="VerbatimChar"/>
+        </w:rPr>
+        <w:t xml:space="preserve">  report --&gt; transaction</w:t>
+      </w:r>
+      <w:r>
+        <w:br/>
+      </w:r>
+      <w:r>
+        <w:rPr>
+          <w:rStyle w:val="VerbatimChar"/>
+        </w:rPr>
+        <w:t xml:space="preserve">  report --&gt; account</w:t>
+      </w:r>
+      <w:r>
+        <w:br/>
+      </w:r>
+      <w:r>
+        <w:rPr>
+          <w:rStyle w:val="VerbatimChar"/>
+        </w:rPr>
+        <w:t xml:space="preserve">  report --&gt; transfer</w:t>
+      </w:r>
+      <w:r>
+        <w:br/>
+      </w:r>
+      <w:r>
+        <w:rPr>
+          <w:rStyle w:val="VerbatimChar"/>
+        </w:rPr>
+        <w:t xml:space="preserve">  user --&gt; role</w:t>
+      </w:r>
+      <w:r>
+        <w:br/>
+      </w:r>
+      <w:r>
+        <w:rPr>
+          <w:rStyle w:val="VerbatimChar"/>
+        </w:rPr>
+        <w:t xml:space="preserve">  dashboard --&gt; customer</w:t>
+      </w:r>
+      <w:r>
+        <w:br/>
+      </w:r>
+      <w:r>
+        <w:rPr>
+          <w:rStyle w:val="VerbatimChar"/>
+        </w:rPr>
+        <w:t xml:space="preserve">  dashboard --&gt; account</w:t>
+      </w:r>
+      <w:r>
+        <w:br/>
+      </w:r>
+      <w:r>
+        <w:rPr>
+          <w:rStyle w:val="VerbatimChar"/>
+        </w:rPr>
+        <w:t xml:space="preserve">  dashboard --&gt; user</w:t>
+      </w:r>
+    </w:p>
+    <w:p>
+      <w:pPr>
+        <w:pStyle w:val="FirstParagraph"/>
+      </w:pPr>
+      <w:r>
+        <w:t xml:space="preserve">Implemented packages include</w:t>
+      </w:r>
+      <w:r>
+        <w:t xml:space="preserve"> </w:t>
+      </w:r>
+      <w:r>
+        <w:rPr>
+          <w:rStyle w:val="VerbatimChar"/>
+        </w:rPr>
+        <w:t xml:space="preserve">transaction</w:t>
+      </w:r>
+      <w:r>
+        <w:t xml:space="preserve">,</w:t>
+      </w:r>
+      <w:r>
+        <w:t xml:space="preserve"> </w:t>
+      </w:r>
+      <w:r>
+        <w:rPr>
+          <w:rStyle w:val="VerbatimChar"/>
+        </w:rPr>
+        <w:t xml:space="preserve">notification</w:t>
+      </w:r>
+      <w:r>
+        <w:t xml:space="preserve">,</w:t>
+      </w:r>
+      <w:r>
+        <w:t xml:space="preserve"> </w:t>
+      </w:r>
+      <w:r>
+        <w:rPr>
+          <w:rStyle w:val="VerbatimChar"/>
+        </w:rPr>
+        <w:t xml:space="preserve">portal</w:t>
+      </w:r>
+      <w:r>
+        <w:t xml:space="preserve">,</w:t>
+      </w:r>
+      <w:r>
+        <w:t xml:space="preserve"> </w:t>
+      </w:r>
+      <w:r>
+        <w:rPr>
+          <w:rStyle w:val="VerbatimChar"/>
+        </w:rPr>
+        <w:t xml:space="preserve">beneficiary</w:t>
+      </w:r>
+      <w:r>
+        <w:t xml:space="preserve">,</w:t>
+      </w:r>
+      <w:r>
+        <w:t xml:space="preserve"> </w:t>
+      </w:r>
+      <w:r>
+        <w:rPr>
+          <w:rStyle w:val="VerbatimChar"/>
+        </w:rPr>
+        <w:t xml:space="preserve">transfer</w:t>
+      </w:r>
+      <w:r>
+        <w:t xml:space="preserve">,</w:t>
+      </w:r>
+      <w:r>
+        <w:t xml:space="preserve"> </w:t>
+      </w:r>
+      <w:r>
+        <w:rPr>
+          <w:rStyle w:val="VerbatimChar"/>
+        </w:rPr>
+        <w:t xml:space="preserve">audit</w:t>
+      </w:r>
+      <w:r>
+        <w:t xml:space="preserve">,</w:t>
+      </w:r>
+      <w:r>
+        <w:t xml:space="preserve"> </w:t>
+      </w:r>
+      <w:r>
+        <w:rPr>
+          <w:rStyle w:val="VerbatimChar"/>
+        </w:rPr>
+        <w:t xml:space="preserve">report</w:t>
+      </w:r>
+      <w:r>
+        <w:t xml:space="preserve">. Still stub:</w:t>
+      </w:r>
+      <w:r>
+        <w:t xml:space="preserve"> </w:t>
+      </w:r>
+      <w:r>
+        <w:rPr>
+          <w:rStyle w:val="VerbatimChar"/>
+        </w:rPr>
+        <w:t xml:space="preserve">branch</w:t>
+      </w:r>
+      <w:r>
+        <w:t xml:space="preserve">,</w:t>
+      </w:r>
+      <w:r>
+        <w:t xml:space="preserve"> </w:t>
+      </w:r>
+      <w:r>
+        <w:t xml:space="preserve">full</w:t>
+      </w:r>
+      <w:r>
+        <w:t xml:space="preserve"> </w:t>
+      </w:r>
+      <w:r>
+        <w:rPr>
+          <w:rStyle w:val="VerbatimChar"/>
+        </w:rPr>
+        <w:t xml:space="preserve">loan</w:t>
+      </w:r>
+      <w:r>
+        <w:t xml:space="preserve"> </w:t>
+      </w:r>
+      <w:r>
+        <w:t xml:space="preserve">product.</w:t>
+      </w:r>
+    </w:p>
+    <w:bookmarkEnd w:id="12"/>
+    <w:bookmarkStart w:id="13" w:name="layering-per-feature-module"/>
+    <w:p>
+      <w:pPr>
+        <w:pStyle w:val="Heading2"/>
+      </w:pPr>
+      <w:r>
+        <w:t xml:space="preserve">Layering (per feature module)</w:t>
+      </w:r>
+    </w:p>
+    <w:p>
+      <w:pPr>
+        <w:pStyle w:val="SourceCode"/>
+      </w:pPr>
+      <w:r>
+        <w:rPr>
+          <w:rStyle w:val="VerbatimChar"/>
+        </w:rPr>
         <w:t xml:space="preserve">controller → service (interface + impl) → repository → entity</w:t>
       </w:r>
       <w:r>
@@ -630,8 +855,6 @@
     <w:p>
       <w:pPr>
         <w:pStyle w:val="FirstParagraph"/>
-        <w:spacing w:after="160" w:line="276" w:lineRule="auto"/>
-        <w:jc w:val="left"/>
       </w:pPr>
       <w:r>
         <w:t xml:space="preserve">Cross-cutting concerns live under</w:t>
@@ -652,17 +875,9 @@
     <w:tbl>
       <w:tblPr>
         <w:tblStyle w:val="Table"/>
-        <w:tblW w:type="pct" w:w="5000"/>
-        <w:tblLayout w:type="autofit"/>
+        <w:tblW w:type="pct" w:w="4306"/>
+        <w:tblLayout w:type="fixed"/>
         <w:tblLook w:firstRow="1" w:lastRow="0" w:firstColumn="0" w:lastColumn="0" w:noHBand="0" w:noVBand="0" w:val="0020"/>
-        <w:tblBorders>
-          <w:top w:val="single" w:sz="4" w:space="0" w:color="CBD5E0"/>
-          <w:left w:val="single" w:sz="4" w:space="0" w:color="CBD5E0"/>
-          <w:bottom w:val="single" w:sz="4" w:space="0" w:color="CBD5E0"/>
-          <w:right w:val="single" w:sz="4" w:space="0" w:color="CBD5E0"/>
-          <w:insideH w:val="single" w:sz="4" w:space="0" w:color="CBD5E0"/>
-          <w:insideV w:val="single" w:sz="4" w:space="0" w:color="CBD5E0"/>
-        </w:tblBorders>
       </w:tblPr>
       <w:tblGrid>
         <w:gridCol w:w="3410"/>
@@ -673,55 +888,25 @@
           <w:tblHeader w:val="on"/>
         </w:trPr>
         <w:tc>
-          <w:tcPr>
-            <w:tcMar>
-              <w:top w:w="40" w:type="dxa"/>
-              <w:bottom w:w="40" w:type="dxa"/>
-              <w:left w:w="60" w:type="dxa"/>
-              <w:right w:w="60" w:type="dxa"/>
-            </w:tcMar>
-            <w:shd w:fill="1A365D" w:val="clear"/>
-          </w:tcPr>
+          <w:tcPr/>
           <w:p>
             <w:pPr>
               <w:pStyle w:val="Compact"/>
-              <w:spacing w:before="0" w:after="40" w:line="264" w:lineRule="auto"/>
               <w:jc w:val="left"/>
             </w:pPr>
             <w:r>
-              <w:rPr>
-                <w:rFonts w:ascii="Calibri" w:hAnsi="Calibri"/>
-                <w:b/>
-                <w:color w:val="FFFFFF"/>
-                <w:sz w:val="18"/>
-              </w:rPr>
               <w:t xml:space="preserve">Area</w:t>
             </w:r>
           </w:p>
         </w:tc>
         <w:tc>
-          <w:tcPr>
-            <w:tcMar>
-              <w:top w:w="40" w:type="dxa"/>
-              <w:bottom w:w="40" w:type="dxa"/>
-              <w:left w:w="60" w:type="dxa"/>
-              <w:right w:w="60" w:type="dxa"/>
-            </w:tcMar>
-            <w:shd w:fill="1A365D" w:val="clear"/>
-          </w:tcPr>
+          <w:tcPr/>
           <w:p>
             <w:pPr>
               <w:pStyle w:val="Compact"/>
-              <w:spacing w:before="0" w:after="40" w:line="264" w:lineRule="auto"/>
               <w:jc w:val="left"/>
             </w:pPr>
             <w:r>
-              <w:rPr>
-                <w:rFonts w:ascii="Calibri" w:hAnsi="Calibri"/>
-                <w:b/>
-                <w:color w:val="FFFFFF"/>
-                <w:sz w:val="18"/>
-              </w:rPr>
               <w:t xml:space="preserve">Classes</w:t>
             </w:r>
           </w:p>
@@ -729,71 +914,39 @@
       </w:tr>
       <w:tr>
         <w:tc>
-          <w:tcPr>
-            <w:tcMar>
-              <w:top w:w="40" w:type="dxa"/>
-              <w:bottom w:w="40" w:type="dxa"/>
-              <w:left w:w="60" w:type="dxa"/>
-              <w:right w:w="60" w:type="dxa"/>
-            </w:tcMar>
-          </w:tcPr>
+          <w:tcPr/>
           <w:p>
             <w:pPr>
               <w:pStyle w:val="Compact"/>
-              <w:spacing w:before="0" w:after="40" w:line="264" w:lineRule="auto"/>
               <w:jc w:val="left"/>
             </w:pPr>
             <w:r>
-              <w:rPr>
-                <w:rFonts w:ascii="Calibri" w:hAnsi="Calibri"/>
-                <w:sz w:val="18"/>
-              </w:rPr>
               <w:t xml:space="preserve">Security</w:t>
             </w:r>
           </w:p>
         </w:tc>
         <w:tc>
-          <w:tcPr>
-            <w:tcMar>
-              <w:top w:w="40" w:type="dxa"/>
-              <w:bottom w:w="40" w:type="dxa"/>
-              <w:left w:w="60" w:type="dxa"/>
-              <w:right w:w="60" w:type="dxa"/>
-            </w:tcMar>
-          </w:tcPr>
+          <w:tcPr/>
           <w:p>
             <w:pPr>
               <w:pStyle w:val="Compact"/>
-              <w:spacing w:before="0" w:after="40" w:line="264" w:lineRule="auto"/>
               <w:jc w:val="left"/>
             </w:pPr>
             <w:r>
               <w:rPr>
                 <w:rStyle w:val="VerbatimChar"/>
-                <w:rFonts w:ascii="Calibri" w:hAnsi="Calibri"/>
-                <w:sz w:val="18"/>
               </w:rPr>
               <w:t xml:space="preserve">SecurityConfig</w:t>
             </w:r>
             <w:r>
-              <w:rPr>
-                <w:rFonts w:ascii="Calibri" w:hAnsi="Calibri"/>
-                <w:sz w:val="18"/>
-              </w:rPr>
               <w:t xml:space="preserve">,</w:t>
             </w:r>
             <w:r>
-              <w:rPr>
-                <w:rFonts w:ascii="Calibri" w:hAnsi="Calibri"/>
-                <w:sz w:val="18"/>
-              </w:rPr>
               <w:t xml:space="preserve"> </w:t>
             </w:r>
             <w:r>
               <w:rPr>
                 <w:rStyle w:val="VerbatimChar"/>
-                <w:rFonts w:ascii="Calibri" w:hAnsi="Calibri"/>
-                <w:sz w:val="18"/>
               </w:rPr>
               <w:t xml:space="preserve">JpaAuditingConfig</w:t>
             </w:r>
@@ -802,71 +955,37 @@
       </w:tr>
       <w:tr>
         <w:tc>
-          <w:tcPr>
-            <w:tcMar>
-              <w:top w:w="40" w:type="dxa"/>
-              <w:bottom w:w="40" w:type="dxa"/>
-              <w:left w:w="60" w:type="dxa"/>
-              <w:right w:w="60" w:type="dxa"/>
-            </w:tcMar>
-          </w:tcPr>
+          <w:tcPr/>
           <w:p>
             <w:pPr>
               <w:pStyle w:val="Compact"/>
-              <w:spacing w:before="0" w:after="40" w:line="264" w:lineRule="auto"/>
               <w:jc w:val="left"/>
             </w:pPr>
             <w:r>
-              <w:rPr>
-                <w:rFonts w:ascii="Calibri" w:hAnsi="Calibri"/>
-                <w:sz w:val="18"/>
-              </w:rPr>
               <w:t xml:space="preserve">Exceptions</w:t>
             </w:r>
           </w:p>
         </w:tc>
         <w:tc>
-          <w:tcPr>
-            <w:tcMar>
-              <w:top w:w="40" w:type="dxa"/>
-              <w:bottom w:w="40" w:type="dxa"/>
-              <w:left w:w="60" w:type="dxa"/>
-              <w:right w:w="60" w:type="dxa"/>
-            </w:tcMar>
-          </w:tcPr>
+          <w:tcPr/>
           <w:p>
             <w:pPr>
               <w:pStyle w:val="Compact"/>
-              <w:spacing w:before="0" w:after="40" w:line="264" w:lineRule="auto"/>
               <w:jc w:val="left"/>
             </w:pPr>
             <w:r>
               <w:rPr>
                 <w:rStyle w:val="VerbatimChar"/>
-                <w:rFonts w:ascii="Calibri" w:hAnsi="Calibri"/>
-                <w:sz w:val="18"/>
               </w:rPr>
               <w:t xml:space="preserve">GlobalExceptionHandler</w:t>
             </w:r>
             <w:r>
-              <w:rPr>
-                <w:rFonts w:ascii="Calibri" w:hAnsi="Calibri"/>
-                <w:sz w:val="18"/>
-              </w:rPr>
               <w:t xml:space="preserve">,</w:t>
             </w:r>
             <w:r>
-              <w:rPr>
-                <w:rFonts w:ascii="Calibri" w:hAnsi="Calibri"/>
-                <w:sz w:val="18"/>
-              </w:rPr>
               <w:t xml:space="preserve"> </w:t>
             </w:r>
             <w:r>
-              <w:rPr>
-                <w:rFonts w:ascii="Calibri" w:hAnsi="Calibri"/>
-                <w:sz w:val="18"/>
-              </w:rPr>
               <w:t xml:space="preserve">domain exceptions</w:t>
             </w:r>
           </w:p>
@@ -874,49 +993,27 @@
       </w:tr>
       <w:tr>
         <w:tc>
-          <w:tcPr>
-            <w:tcMar>
-              <w:top w:w="40" w:type="dxa"/>
-              <w:bottom w:w="40" w:type="dxa"/>
-              <w:left w:w="60" w:type="dxa"/>
-              <w:right w:w="60" w:type="dxa"/>
-            </w:tcMar>
-          </w:tcPr>
+          <w:tcPr/>
           <w:p>
             <w:pPr>
               <w:pStyle w:val="Compact"/>
-              <w:spacing w:before="0" w:after="40" w:line="264" w:lineRule="auto"/>
               <w:jc w:val="left"/>
             </w:pPr>
             <w:r>
-              <w:rPr>
-                <w:rFonts w:ascii="Calibri" w:hAnsi="Calibri"/>
-                <w:sz w:val="18"/>
-              </w:rPr>
               <w:t xml:space="preserve">Audit base</w:t>
             </w:r>
           </w:p>
         </w:tc>
         <w:tc>
-          <w:tcPr>
-            <w:tcMar>
-              <w:top w:w="40" w:type="dxa"/>
-              <w:bottom w:w="40" w:type="dxa"/>
-              <w:left w:w="60" w:type="dxa"/>
-              <w:right w:w="60" w:type="dxa"/>
-            </w:tcMar>
-          </w:tcPr>
+          <w:tcPr/>
           <w:p>
             <w:pPr>
               <w:pStyle w:val="Compact"/>
-              <w:spacing w:before="0" w:after="40" w:line="264" w:lineRule="auto"/>
               <w:jc w:val="left"/>
             </w:pPr>
             <w:r>
               <w:rPr>
                 <w:rStyle w:val="VerbatimChar"/>
-                <w:rFonts w:ascii="Calibri" w:hAnsi="Calibri"/>
-                <w:sz w:val="18"/>
               </w:rPr>
               <w:t xml:space="preserve">AuditableEntity</w:t>
             </w:r>
@@ -925,49 +1022,27 @@
       </w:tr>
       <w:tr>
         <w:tc>
-          <w:tcPr>
-            <w:tcMar>
-              <w:top w:w="40" w:type="dxa"/>
-              <w:bottom w:w="40" w:type="dxa"/>
-              <w:left w:w="60" w:type="dxa"/>
-              <w:right w:w="60" w:type="dxa"/>
-            </w:tcMar>
-          </w:tcPr>
+          <w:tcPr/>
           <w:p>
             <w:pPr>
               <w:pStyle w:val="Compact"/>
-              <w:spacing w:before="0" w:after="40" w:line="264" w:lineRule="auto"/>
               <w:jc w:val="left"/>
             </w:pPr>
             <w:r>
-              <w:rPr>
-                <w:rFonts w:ascii="Calibri" w:hAnsi="Calibri"/>
-                <w:sz w:val="18"/>
-              </w:rPr>
               <w:t xml:space="preserve">Utils</w:t>
             </w:r>
           </w:p>
         </w:tc>
         <w:tc>
-          <w:tcPr>
-            <w:tcMar>
-              <w:top w:w="40" w:type="dxa"/>
-              <w:bottom w:w="40" w:type="dxa"/>
-              <w:left w:w="60" w:type="dxa"/>
-              <w:right w:w="60" w:type="dxa"/>
-            </w:tcMar>
-          </w:tcPr>
+          <w:tcPr/>
           <w:p>
             <w:pPr>
               <w:pStyle w:val="Compact"/>
-              <w:spacing w:before="0" w:after="40" w:line="264" w:lineRule="auto"/>
               <w:jc w:val="left"/>
             </w:pPr>
             <w:r>
               <w:rPr>
                 <w:rStyle w:val="VerbatimChar"/>
-                <w:rFonts w:ascii="Calibri" w:hAnsi="Calibri"/>
-                <w:sz w:val="18"/>
               </w:rPr>
               <w:t xml:space="preserve">BusinessIdFormatter</w:t>
             </w:r>
@@ -975,8 +1050,8 @@
         </w:tc>
       </w:tr>
     </w:tbl>
-    <w:bookmarkEnd w:id="12"/>
-    <w:bookmarkStart w:id="13" w:name="frontend-structure"/>
+    <w:bookmarkEnd w:id="13"/>
+    <w:bookmarkStart w:id="14" w:name="frontend-structure"/>
     <w:p>
       <w:pPr>
         <w:pStyle w:val="Heading2"/>
@@ -1026,8 +1101,6 @@
     <w:p>
       <w:pPr>
         <w:pStyle w:val="FirstParagraph"/>
-        <w:spacing w:after="160" w:line="276" w:lineRule="auto"/>
-        <w:jc w:val="left"/>
       </w:pPr>
       <w:r>
         <w:t xml:space="preserve">Protected routes use</w:t>
@@ -1060,8 +1133,8 @@
         <w:t xml:space="preserve">.</w:t>
       </w:r>
     </w:p>
-    <w:bookmarkEnd w:id="13"/>
-    <w:bookmarkStart w:id="14" w:name="deployment"/>
+    <w:bookmarkEnd w:id="14"/>
+    <w:bookmarkStart w:id="15" w:name="deployment"/>
     <w:p>
       <w:pPr>
         <w:pStyle w:val="Heading2"/>
@@ -1073,17 +1146,9 @@
     <w:tbl>
       <w:tblPr>
         <w:tblStyle w:val="Table"/>
-        <w:tblW w:type="pct" w:w="5000"/>
-        <w:tblLayout w:type="autofit"/>
+        <w:tblW w:type="pct" w:w="4865"/>
+        <w:tblLayout w:type="fixed"/>
         <w:tblLook w:firstRow="1" w:lastRow="0" w:firstColumn="0" w:lastColumn="0" w:noHBand="0" w:noVBand="0" w:val="0020"/>
-        <w:tblBorders>
-          <w:top w:val="single" w:sz="4" w:space="0" w:color="CBD5E0"/>
-          <w:left w:val="single" w:sz="4" w:space="0" w:color="CBD5E0"/>
-          <w:bottom w:val="single" w:sz="4" w:space="0" w:color="CBD5E0"/>
-          <w:right w:val="single" w:sz="4" w:space="0" w:color="CBD5E0"/>
-          <w:insideH w:val="single" w:sz="4" w:space="0" w:color="CBD5E0"/>
-          <w:insideV w:val="single" w:sz="4" w:space="0" w:color="CBD5E0"/>
-        </w:tblBorders>
       </w:tblPr>
       <w:tblGrid>
         <w:gridCol w:w="2140"/>
@@ -1095,82 +1160,37 @@
           <w:tblHeader w:val="on"/>
         </w:trPr>
         <w:tc>
-          <w:tcPr>
-            <w:tcMar>
-              <w:top w:w="40" w:type="dxa"/>
-              <w:bottom w:w="40" w:type="dxa"/>
-              <w:left w:w="60" w:type="dxa"/>
-              <w:right w:w="60" w:type="dxa"/>
-            </w:tcMar>
-            <w:shd w:fill="1A365D" w:val="clear"/>
-          </w:tcPr>
+          <w:tcPr/>
           <w:p>
             <w:pPr>
               <w:pStyle w:val="Compact"/>
-              <w:spacing w:before="0" w:after="40" w:line="264" w:lineRule="auto"/>
               <w:jc w:val="left"/>
             </w:pPr>
             <w:r>
-              <w:rPr>
-                <w:rFonts w:ascii="Calibri" w:hAnsi="Calibri"/>
-                <w:b/>
-                <w:color w:val="FFFFFF"/>
-                <w:sz w:val="18"/>
-              </w:rPr>
               <w:t xml:space="preserve">Mode</w:t>
             </w:r>
           </w:p>
         </w:tc>
         <w:tc>
-          <w:tcPr>
-            <w:tcMar>
-              <w:top w:w="40" w:type="dxa"/>
-              <w:bottom w:w="40" w:type="dxa"/>
-              <w:left w:w="60" w:type="dxa"/>
-              <w:right w:w="60" w:type="dxa"/>
-            </w:tcMar>
-            <w:shd w:fill="1A365D" w:val="clear"/>
-          </w:tcPr>
+          <w:tcPr/>
           <w:p>
             <w:pPr>
               <w:pStyle w:val="Compact"/>
-              <w:spacing w:before="0" w:after="40" w:line="264" w:lineRule="auto"/>
               <w:jc w:val="left"/>
             </w:pPr>
             <w:r>
-              <w:rPr>
-                <w:rFonts w:ascii="Calibri" w:hAnsi="Calibri"/>
-                <w:b/>
-                <w:color w:val="FFFFFF"/>
-                <w:sz w:val="18"/>
-              </w:rPr>
               <w:t xml:space="preserve">Port</w:t>
             </w:r>
           </w:p>
         </w:tc>
         <w:tc>
-          <w:tcPr>
-            <w:tcMar>
-              <w:top w:w="40" w:type="dxa"/>
-              <w:bottom w:w="40" w:type="dxa"/>
-              <w:left w:w="60" w:type="dxa"/>
-              <w:right w:w="60" w:type="dxa"/>
-            </w:tcMar>
-            <w:shd w:fill="1A365D" w:val="clear"/>
-          </w:tcPr>
+          <w:tcPr/>
           <w:p>
             <w:pPr>
               <w:pStyle w:val="Compact"/>
-              <w:spacing w:before="0" w:after="40" w:line="264" w:lineRule="auto"/>
               <w:jc w:val="left"/>
             </w:pPr>
             <w:r>
-              <w:rPr>
-                <w:rFonts w:ascii="Calibri" w:hAnsi="Calibri"/>
-                <w:b/>
-                <w:color w:val="FFFFFF"/>
-                <w:sz w:val="18"/>
-              </w:rPr>
               <w:t xml:space="preserve">Notes</w:t>
             </w:r>
           </w:p>
@@ -1178,182 +1198,92 @@
       </w:tr>
       <w:tr>
         <w:tc>
-          <w:tcPr>
-            <w:tcMar>
-              <w:top w:w="40" w:type="dxa"/>
-              <w:bottom w:w="40" w:type="dxa"/>
-              <w:left w:w="60" w:type="dxa"/>
-              <w:right w:w="60" w:type="dxa"/>
-            </w:tcMar>
-          </w:tcPr>
+          <w:tcPr/>
           <w:p>
             <w:pPr>
               <w:pStyle w:val="Compact"/>
-              <w:spacing w:before="0" w:after="40" w:line="264" w:lineRule="auto"/>
               <w:jc w:val="left"/>
             </w:pPr>
             <w:r>
-              <w:rPr>
-                <w:rFonts w:ascii="Calibri" w:hAnsi="Calibri"/>
-                <w:sz w:val="18"/>
-              </w:rPr>
               <w:t xml:space="preserve">Open Liberty</w:t>
             </w:r>
             <w:r>
-              <w:rPr>
-                <w:rFonts w:ascii="Calibri" w:hAnsi="Calibri"/>
-                <w:sz w:val="18"/>
-              </w:rPr>
               <w:t xml:space="preserve"> </w:t>
             </w:r>
             <w:r>
-              <w:rPr>
-                <w:rFonts w:ascii="Calibri" w:hAnsi="Calibri"/>
-                <w:sz w:val="18"/>
-              </w:rPr>
               <w:t xml:space="preserve">(primary)</w:t>
             </w:r>
           </w:p>
         </w:tc>
         <w:tc>
-          <w:tcPr>
-            <w:tcMar>
-              <w:top w:w="40" w:type="dxa"/>
-              <w:bottom w:w="40" w:type="dxa"/>
-              <w:left w:w="60" w:type="dxa"/>
-              <w:right w:w="60" w:type="dxa"/>
-            </w:tcMar>
-          </w:tcPr>
+          <w:tcPr/>
           <w:p>
             <w:pPr>
               <w:pStyle w:val="Compact"/>
-              <w:spacing w:before="0" w:after="40" w:line="264" w:lineRule="auto"/>
               <w:jc w:val="left"/>
             </w:pPr>
             <w:r>
-              <w:rPr>
-                <w:rFonts w:ascii="Calibri" w:hAnsi="Calibri"/>
-                <w:sz w:val="18"/>
-              </w:rPr>
               <w:t xml:space="preserve">9080 HTTP / 9443</w:t>
             </w:r>
             <w:r>
-              <w:rPr>
-                <w:rFonts w:ascii="Calibri" w:hAnsi="Calibri"/>
-                <w:sz w:val="18"/>
-              </w:rPr>
               <w:t xml:space="preserve"> </w:t>
             </w:r>
             <w:r>
-              <w:rPr>
-                <w:rFonts w:ascii="Calibri" w:hAnsi="Calibri"/>
-                <w:sz w:val="18"/>
-              </w:rPr>
               <w:t xml:space="preserve">HTTPS</w:t>
             </w:r>
           </w:p>
         </w:tc>
         <w:tc>
-          <w:tcPr>
-            <w:tcMar>
-              <w:top w:w="40" w:type="dxa"/>
-              <w:bottom w:w="40" w:type="dxa"/>
-              <w:left w:w="60" w:type="dxa"/>
-              <w:right w:w="60" w:type="dxa"/>
-            </w:tcMar>
-          </w:tcPr>
+          <w:tcPr/>
           <w:p>
             <w:pPr>
               <w:pStyle w:val="Compact"/>
-              <w:spacing w:before="0" w:after="40" w:line="264" w:lineRule="auto"/>
               <w:jc w:val="left"/>
             </w:pPr>
             <w:r>
               <w:rPr>
                 <w:rStyle w:val="VerbatimChar"/>
-                <w:rFonts w:ascii="Calibri" w:hAnsi="Calibri"/>
-                <w:sz w:val="18"/>
               </w:rPr>
               <w:t xml:space="preserve">scripts/redeploy-liberty.sh</w:t>
             </w:r>
             <w:r>
-              <w:rPr>
-                <w:rFonts w:ascii="Calibri" w:hAnsi="Calibri"/>
-                <w:sz w:val="18"/>
-              </w:rPr>
+              <w:t xml:space="preserve"> </w:t>
+            </w:r>
+            <w:r>
+              <w:t xml:space="preserve">JDWP debug</w:t>
+            </w:r>
+            <w:r>
               <w:t xml:space="preserve"> </w:t>
             </w:r>
             <w:r>
               <w:rPr>
-                <w:rFonts w:ascii="Calibri" w:hAnsi="Calibri"/>
-                <w:sz w:val="18"/>
-              </w:rPr>
-              <w:t xml:space="preserve">JDWP debug</w:t>
-            </w:r>
-            <w:r>
-              <w:rPr>
-                <w:rFonts w:ascii="Calibri" w:hAnsi="Calibri"/>
-                <w:sz w:val="18"/>
-              </w:rPr>
-              <w:t xml:space="preserve"> </w:t>
-            </w:r>
-            <w:r>
-              <w:rPr>
-                <w:rFonts w:ascii="Calibri" w:hAnsi="Calibri"/>
                 <w:b/>
                 <w:bCs/>
-                <w:sz w:val="18"/>
               </w:rPr>
               <w:t xml:space="preserve">7777</w:t>
             </w:r>
             <w:r>
-              <w:rPr>
-                <w:rFonts w:ascii="Calibri" w:hAnsi="Calibri"/>
-                <w:sz w:val="18"/>
-              </w:rPr>
               <w:t xml:space="preserve"> </w:t>
             </w:r>
             <w:r>
-              <w:rPr>
-                <w:rFonts w:ascii="Calibri" w:hAnsi="Calibri"/>
-                <w:sz w:val="18"/>
-              </w:rPr>
               <w:t xml:space="preserve">by default</w:t>
             </w:r>
             <w:r>
-              <w:rPr>
-                <w:rFonts w:ascii="Calibri" w:hAnsi="Calibri"/>
-                <w:sz w:val="18"/>
-              </w:rPr>
               <w:t xml:space="preserve"> </w:t>
             </w:r>
             <w:r>
-              <w:rPr>
-                <w:rFonts w:ascii="Calibri" w:hAnsi="Calibri"/>
-                <w:sz w:val="18"/>
-              </w:rPr>
               <w:t xml:space="preserve">(</w:t>
             </w:r>
             <w:r>
               <w:rPr>
                 <w:rStyle w:val="VerbatimChar"/>
-                <w:rFonts w:ascii="Calibri" w:hAnsi="Calibri"/>
-                <w:sz w:val="18"/>
               </w:rPr>
               <w:t xml:space="preserve">LIBERTY_DEBUG=0</w:t>
             </w:r>
             <w:r>
-              <w:rPr>
-                <w:rFonts w:ascii="Calibri" w:hAnsi="Calibri"/>
-                <w:sz w:val="18"/>
-              </w:rPr>
               <w:t xml:space="preserve"> </w:t>
             </w:r>
             <w:r>
-              <w:rPr>
-                <w:rFonts w:ascii="Calibri" w:hAnsi="Calibri"/>
-                <w:sz w:val="18"/>
-              </w:rPr>
               <w:t xml:space="preserve">to disable)</w:t>
             </w:r>
           </w:p>
@@ -1361,73 +1291,39 @@
       </w:tr>
       <w:tr>
         <w:tc>
-          <w:tcPr>
-            <w:tcMar>
-              <w:top w:w="40" w:type="dxa"/>
-              <w:bottom w:w="40" w:type="dxa"/>
-              <w:left w:w="60" w:type="dxa"/>
-              <w:right w:w="60" w:type="dxa"/>
-            </w:tcMar>
-          </w:tcPr>
+          <w:tcPr/>
           <w:p>
             <w:pPr>
               <w:pStyle w:val="Compact"/>
-              <w:spacing w:before="0" w:after="40" w:line="264" w:lineRule="auto"/>
               <w:jc w:val="left"/>
             </w:pPr>
             <w:r>
-              <w:rPr>
-                <w:rFonts w:ascii="Calibri" w:hAnsi="Calibri"/>
-                <w:sz w:val="18"/>
-              </w:rPr>
               <w:t xml:space="preserve">Kafka (local)</w:t>
             </w:r>
           </w:p>
         </w:tc>
         <w:tc>
-          <w:tcPr>
-            <w:tcMar>
-              <w:top w:w="40" w:type="dxa"/>
-              <w:bottom w:w="40" w:type="dxa"/>
-              <w:left w:w="60" w:type="dxa"/>
-              <w:right w:w="60" w:type="dxa"/>
-            </w:tcMar>
-          </w:tcPr>
+          <w:tcPr/>
           <w:p>
             <w:pPr>
               <w:pStyle w:val="Compact"/>
-              <w:spacing w:before="0" w:after="40" w:line="264" w:lineRule="auto"/>
               <w:jc w:val="left"/>
             </w:pPr>
             <w:r>
-              <w:rPr>
-                <w:rFonts w:ascii="Calibri" w:hAnsi="Calibri"/>
-                <w:sz w:val="18"/>
-              </w:rPr>
               <w:t xml:space="preserve">9092</w:t>
             </w:r>
           </w:p>
         </w:tc>
         <w:tc>
-          <w:tcPr>
-            <w:tcMar>
-              <w:top w:w="40" w:type="dxa"/>
-              <w:bottom w:w="40" w:type="dxa"/>
-              <w:left w:w="60" w:type="dxa"/>
-              <w:right w:w="60" w:type="dxa"/>
-            </w:tcMar>
-          </w:tcPr>
+          <w:tcPr/>
           <w:p>
             <w:pPr>
               <w:pStyle w:val="Compact"/>
-              <w:spacing w:before="0" w:after="40" w:line="264" w:lineRule="auto"/>
               <w:jc w:val="left"/>
             </w:pPr>
             <w:r>
               <w:rPr>
                 <w:rStyle w:val="VerbatimChar"/>
-                <w:rFonts w:ascii="Calibri" w:hAnsi="Calibri"/>
-                <w:sz w:val="18"/>
               </w:rPr>
               <w:t xml:space="preserve">docker compose up -d kafka</w:t>
             </w:r>
@@ -1436,73 +1332,39 @@
       </w:tr>
       <w:tr>
         <w:tc>
-          <w:tcPr>
-            <w:tcMar>
-              <w:top w:w="40" w:type="dxa"/>
-              <w:bottom w:w="40" w:type="dxa"/>
-              <w:left w:w="60" w:type="dxa"/>
-              <w:right w:w="60" w:type="dxa"/>
-            </w:tcMar>
-          </w:tcPr>
+          <w:tcPr/>
           <w:p>
             <w:pPr>
               <w:pStyle w:val="Compact"/>
-              <w:spacing w:before="0" w:after="40" w:line="264" w:lineRule="auto"/>
               <w:jc w:val="left"/>
             </w:pPr>
             <w:r>
-              <w:rPr>
-                <w:rFonts w:ascii="Calibri" w:hAnsi="Calibri"/>
-                <w:sz w:val="18"/>
-              </w:rPr>
               <w:t xml:space="preserve">Mailpit (local)</w:t>
             </w:r>
           </w:p>
         </w:tc>
         <w:tc>
-          <w:tcPr>
-            <w:tcMar>
-              <w:top w:w="40" w:type="dxa"/>
-              <w:bottom w:w="40" w:type="dxa"/>
-              <w:left w:w="60" w:type="dxa"/>
-              <w:right w:w="60" w:type="dxa"/>
-            </w:tcMar>
-          </w:tcPr>
+          <w:tcPr/>
           <w:p>
             <w:pPr>
               <w:pStyle w:val="Compact"/>
-              <w:spacing w:before="0" w:after="40" w:line="264" w:lineRule="auto"/>
               <w:jc w:val="left"/>
             </w:pPr>
             <w:r>
-              <w:rPr>
-                <w:rFonts w:ascii="Calibri" w:hAnsi="Calibri"/>
-                <w:sz w:val="18"/>
-              </w:rPr>
               <w:t xml:space="preserve">SMTP 1025 / UI 8025</w:t>
             </w:r>
           </w:p>
         </w:tc>
         <w:tc>
-          <w:tcPr>
-            <w:tcMar>
-              <w:top w:w="40" w:type="dxa"/>
-              <w:bottom w:w="40" w:type="dxa"/>
-              <w:left w:w="60" w:type="dxa"/>
-              <w:right w:w="60" w:type="dxa"/>
-            </w:tcMar>
-          </w:tcPr>
+          <w:tcPr/>
           <w:p>
             <w:pPr>
               <w:pStyle w:val="Compact"/>
-              <w:spacing w:before="0" w:after="40" w:line="264" w:lineRule="auto"/>
               <w:jc w:val="left"/>
             </w:pPr>
             <w:r>
               <w:rPr>
                 <w:rStyle w:val="VerbatimChar"/>
-                <w:rFonts w:ascii="Calibri" w:hAnsi="Calibri"/>
-                <w:sz w:val="18"/>
               </w:rPr>
               <w:t xml:space="preserve">docker compose up -d mailpit</w:t>
             </w:r>
@@ -1511,88 +1373,48 @@
       </w:tr>
       <w:tr>
         <w:tc>
-          <w:tcPr>
-            <w:tcMar>
-              <w:top w:w="40" w:type="dxa"/>
-              <w:bottom w:w="40" w:type="dxa"/>
-              <w:left w:w="60" w:type="dxa"/>
-              <w:right w:w="60" w:type="dxa"/>
-            </w:tcMar>
-          </w:tcPr>
+          <w:tcPr/>
           <w:p>
             <w:pPr>
               <w:pStyle w:val="Compact"/>
-              <w:spacing w:before="0" w:after="40" w:line="264" w:lineRule="auto"/>
               <w:jc w:val="left"/>
             </w:pPr>
             <w:r>
-              <w:rPr>
-                <w:rFonts w:ascii="Calibri" w:hAnsi="Calibri"/>
-                <w:sz w:val="18"/>
-              </w:rPr>
               <w:t xml:space="preserve">Embedded Tomcat</w:t>
             </w:r>
           </w:p>
         </w:tc>
         <w:tc>
-          <w:tcPr>
-            <w:tcMar>
-              <w:top w:w="40" w:type="dxa"/>
-              <w:bottom w:w="40" w:type="dxa"/>
-              <w:left w:w="60" w:type="dxa"/>
-              <w:right w:w="60" w:type="dxa"/>
-            </w:tcMar>
-          </w:tcPr>
+          <w:tcPr/>
           <w:p>
             <w:pPr>
               <w:pStyle w:val="Compact"/>
-              <w:spacing w:before="0" w:after="40" w:line="264" w:lineRule="auto"/>
               <w:jc w:val="left"/>
             </w:pPr>
             <w:r>
-              <w:rPr>
-                <w:rFonts w:ascii="Calibri" w:hAnsi="Calibri"/>
-                <w:sz w:val="18"/>
-              </w:rPr>
               <w:t xml:space="preserve">8080</w:t>
             </w:r>
           </w:p>
         </w:tc>
         <w:tc>
-          <w:tcPr>
-            <w:tcMar>
-              <w:top w:w="40" w:type="dxa"/>
-              <w:bottom w:w="40" w:type="dxa"/>
-              <w:left w:w="60" w:type="dxa"/>
-              <w:right w:w="60" w:type="dxa"/>
-            </w:tcMar>
-          </w:tcPr>
+          <w:tcPr/>
           <w:p>
             <w:pPr>
               <w:pStyle w:val="Compact"/>
-              <w:spacing w:before="0" w:after="40" w:line="264" w:lineRule="auto"/>
               <w:jc w:val="left"/>
             </w:pPr>
             <w:r>
               <w:rPr>
                 <w:rStyle w:val="VerbatimChar"/>
-                <w:rFonts w:ascii="Calibri" w:hAnsi="Calibri"/>
-                <w:sz w:val="18"/>
               </w:rPr>
               <w:t xml:space="preserve">application.properties</w:t>
             </w:r>
             <w:r>
-              <w:rPr>
-                <w:rFonts w:ascii="Calibri" w:hAnsi="Calibri"/>
-                <w:sz w:val="18"/>
-              </w:rPr>
               <w:t xml:space="preserve"> </w:t>
             </w:r>
             <w:r>
               <w:rPr>
                 <w:rStyle w:val="VerbatimChar"/>
-                <w:rFonts w:ascii="Calibri" w:hAnsi="Calibri"/>
-                <w:sz w:val="18"/>
               </w:rPr>
               <w:t xml:space="preserve">server.port</w:t>
             </w:r>
@@ -1601,87 +1423,45 @@
       </w:tr>
       <w:tr>
         <w:tc>
-          <w:tcPr>
-            <w:tcMar>
-              <w:top w:w="40" w:type="dxa"/>
-              <w:bottom w:w="40" w:type="dxa"/>
-              <w:left w:w="60" w:type="dxa"/>
-              <w:right w:w="60" w:type="dxa"/>
-            </w:tcMar>
-          </w:tcPr>
+          <w:tcPr/>
           <w:p>
             <w:pPr>
               <w:pStyle w:val="Compact"/>
-              <w:spacing w:before="0" w:after="40" w:line="264" w:lineRule="auto"/>
               <w:jc w:val="left"/>
             </w:pPr>
             <w:r>
-              <w:rPr>
-                <w:rFonts w:ascii="Calibri" w:hAnsi="Calibri"/>
-                <w:sz w:val="18"/>
-              </w:rPr>
               <w:t xml:space="preserve">Angular</w:t>
             </w:r>
           </w:p>
         </w:tc>
         <w:tc>
-          <w:tcPr>
-            <w:tcMar>
-              <w:top w:w="40" w:type="dxa"/>
-              <w:bottom w:w="40" w:type="dxa"/>
-              <w:left w:w="60" w:type="dxa"/>
-              <w:right w:w="60" w:type="dxa"/>
-            </w:tcMar>
-          </w:tcPr>
+          <w:tcPr/>
           <w:p>
             <w:pPr>
               <w:pStyle w:val="Compact"/>
-              <w:spacing w:before="0" w:after="40" w:line="264" w:lineRule="auto"/>
               <w:jc w:val="left"/>
             </w:pPr>
             <w:r>
-              <w:rPr>
-                <w:rFonts w:ascii="Calibri" w:hAnsi="Calibri"/>
-                <w:sz w:val="18"/>
-              </w:rPr>
               <w:t xml:space="preserve">4200</w:t>
             </w:r>
           </w:p>
         </w:tc>
         <w:tc>
-          <w:tcPr>
-            <w:tcMar>
-              <w:top w:w="40" w:type="dxa"/>
-              <w:bottom w:w="40" w:type="dxa"/>
-              <w:left w:w="60" w:type="dxa"/>
-              <w:right w:w="60" w:type="dxa"/>
-            </w:tcMar>
-          </w:tcPr>
+          <w:tcPr/>
           <w:p>
             <w:pPr>
               <w:pStyle w:val="Compact"/>
-              <w:spacing w:before="0" w:after="40" w:line="264" w:lineRule="auto"/>
               <w:jc w:val="left"/>
             </w:pPr>
             <w:r>
-              <w:rPr>
-                <w:rFonts w:ascii="Calibri" w:hAnsi="Calibri"/>
-                <w:sz w:val="18"/>
-              </w:rPr>
               <w:t xml:space="preserve">Talks to API base in</w:t>
             </w:r>
             <w:r>
-              <w:rPr>
-                <w:rFonts w:ascii="Calibri" w:hAnsi="Calibri"/>
-                <w:sz w:val="18"/>
-              </w:rPr>
               <w:t xml:space="preserve"> </w:t>
             </w:r>
             <w:r>
               <w:rPr>
                 <w:rStyle w:val="VerbatimChar"/>
-                <w:rFonts w:ascii="Calibri" w:hAnsi="Calibri"/>
-                <w:sz w:val="18"/>
               </w:rPr>
               <w:t xml:space="preserve">api-config.ts</w:t>
             </w:r>
@@ -1721,8 +1501,8 @@
         <w:t xml:space="preserve">$WLP_HOME/usr/servers/bankone/apps/</w:t>
       </w:r>
     </w:p>
-    <w:bookmarkEnd w:id="14"/>
-    <w:bookmarkStart w:id="15" w:name="security-architecture"/>
+    <w:bookmarkEnd w:id="15"/>
+    <w:bookmarkStart w:id="16" w:name="security-architecture"/>
     <w:p>
       <w:pPr>
         <w:pStyle w:val="Heading2"/>
@@ -1738,8 +1518,6 @@
           <w:ilvl w:val="0"/>
           <w:numId w:val="1002"/>
         </w:numPr>
-        <w:spacing w:after="160" w:line="276" w:lineRule="auto"/>
-        <w:jc w:val="left"/>
       </w:pPr>
       <w:r>
         <w:t xml:space="preserve">Stateless JWT (</w:t>
@@ -1761,8 +1539,6 @@
           <w:ilvl w:val="0"/>
           <w:numId w:val="1002"/>
         </w:numPr>
-        <w:spacing w:after="160" w:line="276" w:lineRule="auto"/>
-        <w:jc w:val="left"/>
       </w:pPr>
       <w:r>
         <w:t xml:space="preserve">Login public; all other endpoints authenticated</w:t>
@@ -1775,8 +1551,6 @@
           <w:ilvl w:val="0"/>
           <w:numId w:val="1002"/>
         </w:numPr>
-        <w:spacing w:after="160" w:line="276" w:lineRule="auto"/>
-        <w:jc w:val="left"/>
       </w:pPr>
       <w:r>
         <w:t xml:space="preserve">Role checks via</w:t>
@@ -1825,8 +1599,6 @@
           <w:ilvl w:val="0"/>
           <w:numId w:val="1002"/>
         </w:numPr>
-        <w:spacing w:after="160" w:line="276" w:lineRule="auto"/>
-        <w:jc w:val="left"/>
       </w:pPr>
       <w:r>
         <w:t xml:space="preserve">Roles loaded from DB on each request (</w:t>
@@ -1879,8 +1651,6 @@
           <w:ilvl w:val="0"/>
           <w:numId w:val="1002"/>
         </w:numPr>
-        <w:spacing w:after="160" w:line="276" w:lineRule="auto"/>
-        <w:jc w:val="left"/>
       </w:pPr>
       <w:r>
         <w:t xml:space="preserve">Account lockout via</w:t>
@@ -1901,8 +1671,8 @@
         <w:t xml:space="preserve">/ user lock fields</w:t>
       </w:r>
     </w:p>
-    <w:bookmarkEnd w:id="15"/>
-    <w:bookmarkStart w:id="16" w:name="data-architecture"/>
+    <w:bookmarkEnd w:id="16"/>
+    <w:bookmarkStart w:id="17" w:name="data-architecture"/>
     <w:p>
       <w:pPr>
         <w:pStyle w:val="Heading2"/>
@@ -1918,8 +1688,6 @@
           <w:ilvl w:val="0"/>
           <w:numId w:val="1003"/>
         </w:numPr>
-        <w:spacing w:after="160" w:line="276" w:lineRule="auto"/>
-        <w:jc w:val="left"/>
       </w:pPr>
       <w:r>
         <w:t xml:space="preserve">Schema evolution: Hibernate</w:t>
@@ -1941,8 +1709,6 @@
           <w:ilvl w:val="0"/>
           <w:numId w:val="1003"/>
         </w:numPr>
-        <w:spacing w:after="160" w:line="276" w:lineRule="auto"/>
-        <w:jc w:val="left"/>
       </w:pPr>
       <w:r>
         <w:t xml:space="preserve">Explicit SQL:</w:t>
@@ -1985,8 +1751,6 @@
           <w:ilvl w:val="0"/>
           <w:numId w:val="1003"/>
         </w:numPr>
-        <w:spacing w:after="160" w:line="276" w:lineRule="auto"/>
-        <w:jc w:val="left"/>
       </w:pPr>
       <w:r>
         <w:t xml:space="preserve">Soft business IDs:</w:t>
@@ -2022,8 +1786,8 @@
         <w:t xml:space="preserve">), not a DB column</w:t>
       </w:r>
     </w:p>
-    <w:bookmarkEnd w:id="16"/>
-    <w:bookmarkStart w:id="20" w:name="related-docs"/>
+    <w:bookmarkEnd w:id="17"/>
+    <w:bookmarkStart w:id="21" w:name="related-docs"/>
     <w:p>
       <w:pPr>
         <w:pStyle w:val="Heading2"/>
@@ -2039,10 +1803,8 @@
           <w:ilvl w:val="0"/>
           <w:numId w:val="1004"/>
         </w:numPr>
-        <w:spacing w:after="160" w:line="276" w:lineRule="auto"/>
-        <w:jc w:val="left"/>
       </w:pPr>
-      <w:hyperlink r:id="rId17">
+      <w:hyperlink r:id="rId18">
         <w:r>
           <w:rPr>
             <w:rStyle w:val="Hyperlink"/>
@@ -2058,10 +1820,8 @@
           <w:ilvl w:val="0"/>
           <w:numId w:val="1004"/>
         </w:numPr>
-        <w:spacing w:after="160" w:line="276" w:lineRule="auto"/>
-        <w:jc w:val="left"/>
       </w:pPr>
-      <w:hyperlink r:id="rId18">
+      <w:hyperlink r:id="rId19">
         <w:r>
           <w:rPr>
             <w:rStyle w:val="Hyperlink"/>
@@ -2077,10 +1837,8 @@
           <w:ilvl w:val="0"/>
           <w:numId w:val="1004"/>
         </w:numPr>
-        <w:spacing w:after="160" w:line="276" w:lineRule="auto"/>
-        <w:jc w:val="left"/>
       </w:pPr>
-      <w:hyperlink r:id="rId19">
+      <w:hyperlink r:id="rId20">
         <w:r>
           <w:rPr>
             <w:rStyle w:val="Hyperlink"/>
@@ -2089,8 +1847,8 @@
         </w:r>
       </w:hyperlink>
     </w:p>
-    <w:bookmarkEnd w:id="20"/>
     <w:bookmarkEnd w:id="21"/>
+    <w:bookmarkEnd w:id="22"/>
     <w:sectPr>
       <w:pgSz w:h="16838" w:w="11906"/>
       <w:pgMar w:bottom="1134" w:footer="720" w:gutter="0" w:header="720" w:left="1247" w:right="1247" w:top="1134"/>

</xml_diff>

<commit_message>
caching sharding and docs
</commit_message>
<xml_diff>
--- a/docs/ARCHITECTURE.docx
+++ b/docs/ARCHITECTURE.docx
@@ -19,7 +19,7 @@
         <w:t xml:space="preserve">Architecture</w:t>
       </w:r>
     </w:p>
-    <w:bookmarkStart w:id="11" w:name="overview"/>
+    <w:bookmarkStart w:id="12" w:name="overview"/>
     <w:p>
       <w:pPr>
         <w:pStyle w:val="Heading2"/>
@@ -31,6 +31,8 @@
     <w:p>
       <w:pPr>
         <w:pStyle w:val="FirstParagraph"/>
+        <w:spacing w:after="160" w:line="276" w:lineRule="auto"/>
+        <w:jc w:val="left"/>
       </w:pPr>
       <w:r>
         <w:t xml:space="preserve">BankOne is a</w:t>
@@ -98,6 +100,8 @@
           <w:ilvl w:val="0"/>
           <w:numId w:val="1001"/>
         </w:numPr>
+        <w:spacing w:after="160" w:line="276" w:lineRule="auto"/>
+        <w:jc w:val="left"/>
       </w:pPr>
       <w:r>
         <w:rPr>
@@ -130,6 +134,8 @@
           <w:ilvl w:val="0"/>
           <w:numId w:val="1001"/>
         </w:numPr>
+        <w:spacing w:after="160" w:line="276" w:lineRule="auto"/>
+        <w:jc w:val="left"/>
       </w:pPr>
       <w:r>
         <w:rPr>
@@ -176,6 +182,8 @@
           <w:ilvl w:val="0"/>
           <w:numId w:val="1001"/>
         </w:numPr>
+        <w:spacing w:after="160" w:line="276" w:lineRule="auto"/>
+        <w:jc w:val="left"/>
       </w:pPr>
       <w:r>
         <w:rPr>
@@ -197,7 +205,25 @@
         <w:t xml:space="preserve">bankone</w:t>
       </w:r>
       <w:r>
-        <w:t xml:space="preserve">)</w:t>
+        <w:t xml:space="preserve"> </w:t>
+      </w:r>
+      <w:r>
+        <w:t xml:space="preserve">writes; optional</w:t>
+      </w:r>
+      <w:r>
+        <w:t xml:space="preserve"> </w:t>
+      </w:r>
+      <w:r>
+        <w:rPr>
+          <w:rStyle w:val="VerbatimChar"/>
+        </w:rPr>
+        <w:t xml:space="preserve">bankone_read</w:t>
+      </w:r>
+      <w:r>
+        <w:t xml:space="preserve"> </w:t>
+      </w:r>
+      <w:r>
+        <w:t xml:space="preserve">for local read-replica lab)</w:t>
       </w:r>
     </w:p>
     <w:p>
@@ -207,6 +233,49 @@
           <w:ilvl w:val="0"/>
           <w:numId w:val="1001"/>
         </w:numPr>
+        <w:spacing w:after="160" w:line="276" w:lineRule="auto"/>
+        <w:jc w:val="left"/>
+      </w:pPr>
+      <w:r>
+        <w:rPr>
+          <w:b/>
+          <w:bCs/>
+        </w:rPr>
+        <w:t xml:space="preserve">Redis (local):</w:t>
+      </w:r>
+      <w:r>
+        <w:t xml:space="preserve"> </w:t>
+      </w:r>
+      <w:r>
+        <w:t xml:space="preserve">cache-aside for hot reads + Bucket4j rate-limit</w:t>
+      </w:r>
+      <w:r>
+        <w:t xml:space="preserve"> </w:t>
+      </w:r>
+      <w:r>
+        <w:t xml:space="preserve">buckets — see</w:t>
+      </w:r>
+      <w:r>
+        <w:t xml:space="preserve"> </w:t>
+      </w:r>
+      <w:hyperlink r:id="rId9">
+        <w:r>
+          <w:rPr>
+            <w:rStyle w:val="Hyperlink"/>
+          </w:rPr>
+          <w:t xml:space="preserve">MODULES/Caching.md</w:t>
+        </w:r>
+      </w:hyperlink>
+    </w:p>
+    <w:p>
+      <w:pPr>
+        <w:pStyle w:val="Compact"/>
+        <w:numPr>
+          <w:ilvl w:val="0"/>
+          <w:numId w:val="1001"/>
+        </w:numPr>
+        <w:spacing w:after="160" w:line="276" w:lineRule="auto"/>
+        <w:jc w:val="left"/>
       </w:pPr>
       <w:r>
         <w:rPr>
@@ -246,6 +315,8 @@
     <w:p>
       <w:pPr>
         <w:pStyle w:val="FirstParagraph"/>
+        <w:spacing w:after="160" w:line="276" w:lineRule="auto"/>
+        <w:jc w:val="left"/>
       </w:pPr>
       <w:r>
         <w:t xml:space="preserve">Full technology and version inventory:</w:t>
@@ -253,7 +324,7 @@
       <w:r>
         <w:t xml:space="preserve"> </w:t>
       </w:r>
-      <w:hyperlink r:id="rId9">
+      <w:hyperlink r:id="rId10">
         <w:r>
           <w:rPr>
             <w:rStyle w:val="Hyperlink"/>
@@ -275,7 +346,7 @@
       <w:r>
         <w:t xml:space="preserve"> </w:t>
       </w:r>
-      <w:hyperlink r:id="rId10">
+      <w:hyperlink r:id="rId11">
         <w:r>
           <w:rPr>
             <w:rStyle w:val="Hyperlink"/>
@@ -313,7 +384,25 @@
         <w:rPr>
           <w:rStyle w:val="VerbatimChar"/>
         </w:rPr>
-        <w:t xml:space="preserve">  API --&gt; PG[(PostgreSQL :5432)]</w:t>
+        <w:t xml:space="preserve">  API --&gt;|cache-aside| Redis[(Redis :6379)]</w:t>
+      </w:r>
+      <w:r>
+        <w:br/>
+      </w:r>
+      <w:r>
+        <w:rPr>
+          <w:rStyle w:val="VerbatimChar"/>
+        </w:rPr>
+        <w:t xml:space="preserve">  API --&gt;|writes| PG[(PostgreSQL bankone)]</w:t>
+      </w:r>
+      <w:r>
+        <w:br/>
+      </w:r>
+      <w:r>
+        <w:rPr>
+          <w:rStyle w:val="VerbatimChar"/>
+        </w:rPr>
+        <w:t xml:space="preserve">  API --&gt;|reads when replica on| PGR[(bankone_read)]</w:t>
       </w:r>
       <w:r>
         <w:br/>
@@ -343,8 +432,8 @@
         <w:t xml:space="preserve">  Consumer --&gt; Mail[Mailpit or SendGrid]</w:t>
       </w:r>
     </w:p>
-    <w:bookmarkEnd w:id="11"/>
-    <w:bookmarkStart w:id="12" w:name="package-dependencies"/>
+    <w:bookmarkEnd w:id="12"/>
+    <w:bookmarkStart w:id="13" w:name="package-dependencies"/>
     <w:p>
       <w:pPr>
         <w:pStyle w:val="Heading2"/>
@@ -496,6 +585,33 @@
         <w:rPr>
           <w:rStyle w:val="VerbatimChar"/>
         </w:rPr>
+        <w:t xml:space="preserve">    cache[cache]</w:t>
+      </w:r>
+      <w:r>
+        <w:br/>
+      </w:r>
+      <w:r>
+        <w:rPr>
+          <w:rStyle w:val="VerbatimChar"/>
+        </w:rPr>
+        <w:t xml:space="preserve">    ratelimit[ratelimit]</w:t>
+      </w:r>
+      <w:r>
+        <w:br/>
+      </w:r>
+      <w:r>
+        <w:rPr>
+          <w:rStyle w:val="VerbatimChar"/>
+        </w:rPr>
+        <w:t xml:space="preserve">    replica[replica]</w:t>
+      </w:r>
+      <w:r>
+        <w:br/>
+      </w:r>
+      <w:r>
+        <w:rPr>
+          <w:rStyle w:val="VerbatimChar"/>
+        </w:rPr>
         <w:t xml:space="preserve">    common[common]</w:t>
       </w:r>
       <w:r>
@@ -550,6 +666,15 @@
         <w:rPr>
           <w:rStyle w:val="VerbatimChar"/>
         </w:rPr>
+        <w:t xml:space="preserve">  customer --&gt; cache</w:t>
+      </w:r>
+      <w:r>
+        <w:br/>
+      </w:r>
+      <w:r>
+        <w:rPr>
+          <w:rStyle w:val="VerbatimChar"/>
+        </w:rPr>
         <w:t xml:space="preserve">  account --&gt; customer</w:t>
       </w:r>
       <w:r>
@@ -586,6 +711,15 @@
         <w:rPr>
           <w:rStyle w:val="VerbatimChar"/>
         </w:rPr>
+        <w:t xml:space="preserve">  account --&gt; cache</w:t>
+      </w:r>
+      <w:r>
+        <w:br/>
+      </w:r>
+      <w:r>
+        <w:rPr>
+          <w:rStyle w:val="VerbatimChar"/>
+        </w:rPr>
         <w:t xml:space="preserve">  portal --&gt; account</w:t>
       </w:r>
       <w:r>
@@ -687,10 +821,30 @@
         </w:rPr>
         <w:t xml:space="preserve">  dashboard --&gt; user</w:t>
       </w:r>
+      <w:r>
+        <w:br/>
+      </w:r>
+      <w:r>
+        <w:rPr>
+          <w:rStyle w:val="VerbatimChar"/>
+        </w:rPr>
+        <w:t xml:space="preserve">  dashboard --&gt; cache</w:t>
+      </w:r>
+      <w:r>
+        <w:br/>
+      </w:r>
+      <w:r>
+        <w:rPr>
+          <w:rStyle w:val="VerbatimChar"/>
+        </w:rPr>
+        <w:t xml:space="preserve">  role --&gt; cache</w:t>
+      </w:r>
     </w:p>
     <w:p>
       <w:pPr>
         <w:pStyle w:val="FirstParagraph"/>
+        <w:spacing w:after="160" w:line="276" w:lineRule="auto"/>
+        <w:jc w:val="left"/>
       </w:pPr>
       <w:r>
         <w:t xml:space="preserve">Implemented packages include</w:t>
@@ -777,7 +931,55 @@
         <w:t xml:space="preserve">report</w:t>
       </w:r>
       <w:r>
-        <w:t xml:space="preserve">. Still stub:</w:t>
+        <w:t xml:space="preserve">,</w:t>
+      </w:r>
+      <w:r>
+        <w:t xml:space="preserve"> </w:t>
+      </w:r>
+      <w:r>
+        <w:rPr>
+          <w:rStyle w:val="VerbatimChar"/>
+        </w:rPr>
+        <w:t xml:space="preserve">cache</w:t>
+      </w:r>
+      <w:r>
+        <w:t xml:space="preserve"> </w:t>
+      </w:r>
+      <w:r>
+        <w:t xml:space="preserve">(Redis</w:t>
+      </w:r>
+      <w:r>
+        <w:t xml:space="preserve"> </w:t>
+      </w:r>
+      <w:r>
+        <w:t xml:space="preserve">cache-aside),</w:t>
+      </w:r>
+      <w:r>
+        <w:t xml:space="preserve"> </w:t>
+      </w:r>
+      <w:r>
+        <w:rPr>
+          <w:rStyle w:val="VerbatimChar"/>
+        </w:rPr>
+        <w:t xml:space="preserve">ratelimit</w:t>
+      </w:r>
+      <w:r>
+        <w:t xml:space="preserve">,</w:t>
+      </w:r>
+      <w:r>
+        <w:t xml:space="preserve"> </w:t>
+      </w:r>
+      <w:r>
+        <w:rPr>
+          <w:rStyle w:val="VerbatimChar"/>
+        </w:rPr>
+        <w:t xml:space="preserve">replica</w:t>
+      </w:r>
+      <w:r>
+        <w:t xml:space="preserve"> </w:t>
+      </w:r>
+      <w:r>
+        <w:t xml:space="preserve">(local lab). Still stub:</w:t>
       </w:r>
       <w:r>
         <w:t xml:space="preserve"> </w:t>
@@ -812,15 +1014,11 @@
       <w:r>
         <w:t xml:space="preserve">product.</w:t>
       </w:r>
-    </w:p>
-    <w:bookmarkEnd w:id="12"/>
-    <w:bookmarkStart w:id="13" w:name="layering-per-feature-module"/>
-    <w:p>
-      <w:pPr>
-        <w:pStyle w:val="Heading2"/>
-      </w:pPr>
-      <w:r>
-        <w:t xml:space="preserve">Layering (per feature module)</w:t>
+      <w:r>
+        <w:t xml:space="preserve"> </w:t>
+      </w:r>
+      <w:r>
+        <w:t xml:space="preserve">## Layering (per feature module)</w:t>
       </w:r>
     </w:p>
     <w:p>
@@ -855,6 +1053,8 @@
     <w:p>
       <w:pPr>
         <w:pStyle w:val="FirstParagraph"/>
+        <w:spacing w:after="160" w:line="276" w:lineRule="auto"/>
+        <w:jc w:val="left"/>
       </w:pPr>
       <w:r>
         <w:t xml:space="preserve">Cross-cutting concerns live under</w:t>
@@ -875,9 +1075,17 @@
     <w:tbl>
       <w:tblPr>
         <w:tblStyle w:val="Table"/>
-        <w:tblW w:type="pct" w:w="4306"/>
-        <w:tblLayout w:type="fixed"/>
+        <w:tblW w:type="pct" w:w="5000"/>
+        <w:tblLayout w:type="autofit"/>
         <w:tblLook w:firstRow="1" w:lastRow="0" w:firstColumn="0" w:lastColumn="0" w:noHBand="0" w:noVBand="0" w:val="0020"/>
+        <w:tblBorders>
+          <w:top w:val="single" w:sz="4" w:space="0" w:color="CBD5E0"/>
+          <w:left w:val="single" w:sz="4" w:space="0" w:color="CBD5E0"/>
+          <w:bottom w:val="single" w:sz="4" w:space="0" w:color="CBD5E0"/>
+          <w:right w:val="single" w:sz="4" w:space="0" w:color="CBD5E0"/>
+          <w:insideH w:val="single" w:sz="4" w:space="0" w:color="CBD5E0"/>
+          <w:insideV w:val="single" w:sz="4" w:space="0" w:color="CBD5E0"/>
+        </w:tblBorders>
       </w:tblPr>
       <w:tblGrid>
         <w:gridCol w:w="3410"/>
@@ -888,25 +1096,67 @@
           <w:tblHeader w:val="on"/>
         </w:trPr>
         <w:tc>
-          <w:tcPr/>
+          <w:tcPr>
+            <w:tcMar>
+              <w:top w:w="40" w:type="dxa"/>
+              <w:bottom w:w="40" w:type="dxa"/>
+              <w:left w:w="60" w:type="dxa"/>
+              <w:right w:w="60" w:type="dxa"/>
+            </w:tcMar>
+            <w:shd w:fill="1A365D" w:val="clear"/>
+            <w:tcMar>
+              <w:top w:w="40" w:type="dxa"/>
+              <w:bottom w:w="40" w:type="dxa"/>
+              <w:left w:w="60" w:type="dxa"/>
+              <w:right w:w="60" w:type="dxa"/>
+            </w:tcMar>
+          </w:tcPr>
           <w:p>
             <w:pPr>
               <w:pStyle w:val="Compact"/>
+              <w:spacing w:before="0" w:after="40" w:line="264" w:lineRule="auto"/>
               <w:jc w:val="left"/>
             </w:pPr>
             <w:r>
+              <w:rPr>
+                <w:rFonts w:ascii="Calibri" w:hAnsi="Calibri"/>
+                <w:b/>
+                <w:color w:val="FFFFFF"/>
+                <w:sz w:val="18"/>
+              </w:rPr>
               <w:t xml:space="preserve">Area</w:t>
             </w:r>
           </w:p>
         </w:tc>
         <w:tc>
-          <w:tcPr/>
+          <w:tcPr>
+            <w:tcMar>
+              <w:top w:w="40" w:type="dxa"/>
+              <w:bottom w:w="40" w:type="dxa"/>
+              <w:left w:w="60" w:type="dxa"/>
+              <w:right w:w="60" w:type="dxa"/>
+            </w:tcMar>
+            <w:shd w:fill="1A365D" w:val="clear"/>
+            <w:tcMar>
+              <w:top w:w="40" w:type="dxa"/>
+              <w:bottom w:w="40" w:type="dxa"/>
+              <w:left w:w="60" w:type="dxa"/>
+              <w:right w:w="60" w:type="dxa"/>
+            </w:tcMar>
+          </w:tcPr>
           <w:p>
             <w:pPr>
               <w:pStyle w:val="Compact"/>
+              <w:spacing w:before="0" w:after="40" w:line="264" w:lineRule="auto"/>
               <w:jc w:val="left"/>
             </w:pPr>
             <w:r>
+              <w:rPr>
+                <w:rFonts w:ascii="Calibri" w:hAnsi="Calibri"/>
+                <w:b/>
+                <w:color w:val="FFFFFF"/>
+                <w:sz w:val="18"/>
+              </w:rPr>
               <w:t xml:space="preserve">Classes</w:t>
             </w:r>
           </w:p>
@@ -914,39 +1164,83 @@
       </w:tr>
       <w:tr>
         <w:tc>
-          <w:tcPr/>
+          <w:tcPr>
+            <w:tcMar>
+              <w:top w:w="40" w:type="dxa"/>
+              <w:bottom w:w="40" w:type="dxa"/>
+              <w:left w:w="60" w:type="dxa"/>
+              <w:right w:w="60" w:type="dxa"/>
+            </w:tcMar>
+            <w:tcMar>
+              <w:top w:w="40" w:type="dxa"/>
+              <w:bottom w:w="40" w:type="dxa"/>
+              <w:left w:w="60" w:type="dxa"/>
+              <w:right w:w="60" w:type="dxa"/>
+            </w:tcMar>
+          </w:tcPr>
           <w:p>
             <w:pPr>
               <w:pStyle w:val="Compact"/>
+              <w:spacing w:before="0" w:after="40" w:line="264" w:lineRule="auto"/>
               <w:jc w:val="left"/>
             </w:pPr>
             <w:r>
+              <w:rPr>
+                <w:rFonts w:ascii="Calibri" w:hAnsi="Calibri"/>
+                <w:sz w:val="18"/>
+              </w:rPr>
               <w:t xml:space="preserve">Security</w:t>
             </w:r>
           </w:p>
         </w:tc>
         <w:tc>
-          <w:tcPr/>
+          <w:tcPr>
+            <w:tcMar>
+              <w:top w:w="40" w:type="dxa"/>
+              <w:bottom w:w="40" w:type="dxa"/>
+              <w:left w:w="60" w:type="dxa"/>
+              <w:right w:w="60" w:type="dxa"/>
+            </w:tcMar>
+            <w:tcMar>
+              <w:top w:w="40" w:type="dxa"/>
+              <w:bottom w:w="40" w:type="dxa"/>
+              <w:left w:w="60" w:type="dxa"/>
+              <w:right w:w="60" w:type="dxa"/>
+            </w:tcMar>
+          </w:tcPr>
           <w:p>
             <w:pPr>
               <w:pStyle w:val="Compact"/>
+              <w:spacing w:before="0" w:after="40" w:line="264" w:lineRule="auto"/>
               <w:jc w:val="left"/>
             </w:pPr>
             <w:r>
               <w:rPr>
                 <w:rStyle w:val="VerbatimChar"/>
+                <w:rFonts w:ascii="Calibri" w:hAnsi="Calibri"/>
+                <w:sz w:val="18"/>
               </w:rPr>
               <w:t xml:space="preserve">SecurityConfig</w:t>
             </w:r>
             <w:r>
+              <w:rPr>
+                <w:rFonts w:ascii="Calibri" w:hAnsi="Calibri"/>
+                <w:sz w:val="18"/>
+              </w:rPr>
               <w:t xml:space="preserve">,</w:t>
             </w:r>
             <w:r>
+              <w:rPr>
+                <w:rFonts w:ascii="Calibri" w:hAnsi="Calibri"/>
+                <w:sz w:val="18"/>
+              </w:rPr>
               <w:t xml:space="preserve"> </w:t>
             </w:r>
             <w:r>
               <w:rPr>
                 <w:rStyle w:val="VerbatimChar"/>
+                <w:rFonts w:ascii="Calibri" w:hAnsi="Calibri"/>
+                <w:sz w:val="18"/>
               </w:rPr>
               <w:t xml:space="preserve">JpaAuditingConfig</w:t>
             </w:r>
@@ -955,37 +1249,83 @@
       </w:tr>
       <w:tr>
         <w:tc>
-          <w:tcPr/>
+          <w:tcPr>
+            <w:tcMar>
+              <w:top w:w="40" w:type="dxa"/>
+              <w:bottom w:w="40" w:type="dxa"/>
+              <w:left w:w="60" w:type="dxa"/>
+              <w:right w:w="60" w:type="dxa"/>
+            </w:tcMar>
+            <w:tcMar>
+              <w:top w:w="40" w:type="dxa"/>
+              <w:bottom w:w="40" w:type="dxa"/>
+              <w:left w:w="60" w:type="dxa"/>
+              <w:right w:w="60" w:type="dxa"/>
+            </w:tcMar>
+          </w:tcPr>
           <w:p>
             <w:pPr>
               <w:pStyle w:val="Compact"/>
+              <w:spacing w:before="0" w:after="40" w:line="264" w:lineRule="auto"/>
               <w:jc w:val="left"/>
             </w:pPr>
             <w:r>
+              <w:rPr>
+                <w:rFonts w:ascii="Calibri" w:hAnsi="Calibri"/>
+                <w:sz w:val="18"/>
+              </w:rPr>
               <w:t xml:space="preserve">Exceptions</w:t>
             </w:r>
           </w:p>
         </w:tc>
         <w:tc>
-          <w:tcPr/>
+          <w:tcPr>
+            <w:tcMar>
+              <w:top w:w="40" w:type="dxa"/>
+              <w:bottom w:w="40" w:type="dxa"/>
+              <w:left w:w="60" w:type="dxa"/>
+              <w:right w:w="60" w:type="dxa"/>
+            </w:tcMar>
+            <w:tcMar>
+              <w:top w:w="40" w:type="dxa"/>
+              <w:bottom w:w="40" w:type="dxa"/>
+              <w:left w:w="60" w:type="dxa"/>
+              <w:right w:w="60" w:type="dxa"/>
+            </w:tcMar>
+          </w:tcPr>
           <w:p>
             <w:pPr>
               <w:pStyle w:val="Compact"/>
+              <w:spacing w:before="0" w:after="40" w:line="264" w:lineRule="auto"/>
               <w:jc w:val="left"/>
             </w:pPr>
             <w:r>
               <w:rPr>
                 <w:rStyle w:val="VerbatimChar"/>
+                <w:rFonts w:ascii="Calibri" w:hAnsi="Calibri"/>
+                <w:sz w:val="18"/>
               </w:rPr>
               <w:t xml:space="preserve">GlobalExceptionHandler</w:t>
             </w:r>
             <w:r>
+              <w:rPr>
+                <w:rFonts w:ascii="Calibri" w:hAnsi="Calibri"/>
+                <w:sz w:val="18"/>
+              </w:rPr>
               <w:t xml:space="preserve">,</w:t>
             </w:r>
             <w:r>
+              <w:rPr>
+                <w:rFonts w:ascii="Calibri" w:hAnsi="Calibri"/>
+                <w:sz w:val="18"/>
+              </w:rPr>
               <w:t xml:space="preserve"> </w:t>
             </w:r>
             <w:r>
+              <w:rPr>
+                <w:rFonts w:ascii="Calibri" w:hAnsi="Calibri"/>
+                <w:sz w:val="18"/>
+              </w:rPr>
               <w:t xml:space="preserve">domain exceptions</w:t>
             </w:r>
           </w:p>
@@ -993,27 +1333,61 @@
       </w:tr>
       <w:tr>
         <w:tc>
-          <w:tcPr/>
+          <w:tcPr>
+            <w:tcMar>
+              <w:top w:w="40" w:type="dxa"/>
+              <w:bottom w:w="40" w:type="dxa"/>
+              <w:left w:w="60" w:type="dxa"/>
+              <w:right w:w="60" w:type="dxa"/>
+            </w:tcMar>
+            <w:tcMar>
+              <w:top w:w="40" w:type="dxa"/>
+              <w:bottom w:w="40" w:type="dxa"/>
+              <w:left w:w="60" w:type="dxa"/>
+              <w:right w:w="60" w:type="dxa"/>
+            </w:tcMar>
+          </w:tcPr>
           <w:p>
             <w:pPr>
               <w:pStyle w:val="Compact"/>
+              <w:spacing w:before="0" w:after="40" w:line="264" w:lineRule="auto"/>
               <w:jc w:val="left"/>
             </w:pPr>
             <w:r>
+              <w:rPr>
+                <w:rFonts w:ascii="Calibri" w:hAnsi="Calibri"/>
+                <w:sz w:val="18"/>
+              </w:rPr>
               <w:t xml:space="preserve">Audit base</w:t>
             </w:r>
           </w:p>
         </w:tc>
         <w:tc>
-          <w:tcPr/>
+          <w:tcPr>
+            <w:tcMar>
+              <w:top w:w="40" w:type="dxa"/>
+              <w:bottom w:w="40" w:type="dxa"/>
+              <w:left w:w="60" w:type="dxa"/>
+              <w:right w:w="60" w:type="dxa"/>
+            </w:tcMar>
+            <w:tcMar>
+              <w:top w:w="40" w:type="dxa"/>
+              <w:bottom w:w="40" w:type="dxa"/>
+              <w:left w:w="60" w:type="dxa"/>
+              <w:right w:w="60" w:type="dxa"/>
+            </w:tcMar>
+          </w:tcPr>
           <w:p>
             <w:pPr>
               <w:pStyle w:val="Compact"/>
+              <w:spacing w:before="0" w:after="40" w:line="264" w:lineRule="auto"/>
               <w:jc w:val="left"/>
             </w:pPr>
             <w:r>
               <w:rPr>
                 <w:rStyle w:val="VerbatimChar"/>
+                <w:rFonts w:ascii="Calibri" w:hAnsi="Calibri"/>
+                <w:sz w:val="18"/>
               </w:rPr>
               <w:t xml:space="preserve">AuditableEntity</w:t>
             </w:r>
@@ -1022,27 +1396,61 @@
       </w:tr>
       <w:tr>
         <w:tc>
-          <w:tcPr/>
+          <w:tcPr>
+            <w:tcMar>
+              <w:top w:w="40" w:type="dxa"/>
+              <w:bottom w:w="40" w:type="dxa"/>
+              <w:left w:w="60" w:type="dxa"/>
+              <w:right w:w="60" w:type="dxa"/>
+            </w:tcMar>
+            <w:tcMar>
+              <w:top w:w="40" w:type="dxa"/>
+              <w:bottom w:w="40" w:type="dxa"/>
+              <w:left w:w="60" w:type="dxa"/>
+              <w:right w:w="60" w:type="dxa"/>
+            </w:tcMar>
+          </w:tcPr>
           <w:p>
             <w:pPr>
               <w:pStyle w:val="Compact"/>
+              <w:spacing w:before="0" w:after="40" w:line="264" w:lineRule="auto"/>
               <w:jc w:val="left"/>
             </w:pPr>
             <w:r>
+              <w:rPr>
+                <w:rFonts w:ascii="Calibri" w:hAnsi="Calibri"/>
+                <w:sz w:val="18"/>
+              </w:rPr>
               <w:t xml:space="preserve">Utils</w:t>
             </w:r>
           </w:p>
         </w:tc>
         <w:tc>
-          <w:tcPr/>
+          <w:tcPr>
+            <w:tcMar>
+              <w:top w:w="40" w:type="dxa"/>
+              <w:bottom w:w="40" w:type="dxa"/>
+              <w:left w:w="60" w:type="dxa"/>
+              <w:right w:w="60" w:type="dxa"/>
+            </w:tcMar>
+            <w:tcMar>
+              <w:top w:w="40" w:type="dxa"/>
+              <w:bottom w:w="40" w:type="dxa"/>
+              <w:left w:w="60" w:type="dxa"/>
+              <w:right w:w="60" w:type="dxa"/>
+            </w:tcMar>
+          </w:tcPr>
           <w:p>
             <w:pPr>
               <w:pStyle w:val="Compact"/>
+              <w:spacing w:before="0" w:after="40" w:line="264" w:lineRule="auto"/>
               <w:jc w:val="left"/>
             </w:pPr>
             <w:r>
               <w:rPr>
                 <w:rStyle w:val="VerbatimChar"/>
+                <w:rFonts w:ascii="Calibri" w:hAnsi="Calibri"/>
+                <w:sz w:val="18"/>
               </w:rPr>
               <w:t xml:space="preserve">BusinessIdFormatter</w:t>
             </w:r>
@@ -1101,6 +1509,8 @@
     <w:p>
       <w:pPr>
         <w:pStyle w:val="FirstParagraph"/>
+        <w:spacing w:after="160" w:line="276" w:lineRule="auto"/>
+        <w:jc w:val="left"/>
       </w:pPr>
       <w:r>
         <w:t xml:space="preserve">Protected routes use</w:t>
@@ -1146,9 +1556,17 @@
     <w:tbl>
       <w:tblPr>
         <w:tblStyle w:val="Table"/>
-        <w:tblW w:type="pct" w:w="4865"/>
-        <w:tblLayout w:type="fixed"/>
+        <w:tblW w:type="pct" w:w="5000"/>
+        <w:tblLayout w:type="autofit"/>
         <w:tblLook w:firstRow="1" w:lastRow="0" w:firstColumn="0" w:lastColumn="0" w:noHBand="0" w:noVBand="0" w:val="0020"/>
+        <w:tblBorders>
+          <w:top w:val="single" w:sz="4" w:space="0" w:color="CBD5E0"/>
+          <w:left w:val="single" w:sz="4" w:space="0" w:color="CBD5E0"/>
+          <w:bottom w:val="single" w:sz="4" w:space="0" w:color="CBD5E0"/>
+          <w:right w:val="single" w:sz="4" w:space="0" w:color="CBD5E0"/>
+          <w:insideH w:val="single" w:sz="4" w:space="0" w:color="CBD5E0"/>
+          <w:insideV w:val="single" w:sz="4" w:space="0" w:color="CBD5E0"/>
+        </w:tblBorders>
       </w:tblPr>
       <w:tblGrid>
         <w:gridCol w:w="2140"/>
@@ -1160,37 +1578,100 @@
           <w:tblHeader w:val="on"/>
         </w:trPr>
         <w:tc>
-          <w:tcPr/>
+          <w:tcPr>
+            <w:tcMar>
+              <w:top w:w="40" w:type="dxa"/>
+              <w:bottom w:w="40" w:type="dxa"/>
+              <w:left w:w="60" w:type="dxa"/>
+              <w:right w:w="60" w:type="dxa"/>
+            </w:tcMar>
+            <w:shd w:fill="1A365D" w:val="clear"/>
+            <w:tcMar>
+              <w:top w:w="40" w:type="dxa"/>
+              <w:bottom w:w="40" w:type="dxa"/>
+              <w:left w:w="60" w:type="dxa"/>
+              <w:right w:w="60" w:type="dxa"/>
+            </w:tcMar>
+          </w:tcPr>
           <w:p>
             <w:pPr>
               <w:pStyle w:val="Compact"/>
+              <w:spacing w:before="0" w:after="40" w:line="264" w:lineRule="auto"/>
               <w:jc w:val="left"/>
             </w:pPr>
             <w:r>
+              <w:rPr>
+                <w:rFonts w:ascii="Calibri" w:hAnsi="Calibri"/>
+                <w:b/>
+                <w:color w:val="FFFFFF"/>
+                <w:sz w:val="18"/>
+              </w:rPr>
               <w:t xml:space="preserve">Mode</w:t>
             </w:r>
           </w:p>
         </w:tc>
         <w:tc>
-          <w:tcPr/>
+          <w:tcPr>
+            <w:tcMar>
+              <w:top w:w="40" w:type="dxa"/>
+              <w:bottom w:w="40" w:type="dxa"/>
+              <w:left w:w="60" w:type="dxa"/>
+              <w:right w:w="60" w:type="dxa"/>
+            </w:tcMar>
+            <w:shd w:fill="1A365D" w:val="clear"/>
+            <w:tcMar>
+              <w:top w:w="40" w:type="dxa"/>
+              <w:bottom w:w="40" w:type="dxa"/>
+              <w:left w:w="60" w:type="dxa"/>
+              <w:right w:w="60" w:type="dxa"/>
+            </w:tcMar>
+          </w:tcPr>
           <w:p>
             <w:pPr>
               <w:pStyle w:val="Compact"/>
+              <w:spacing w:before="0" w:after="40" w:line="264" w:lineRule="auto"/>
               <w:jc w:val="left"/>
             </w:pPr>
             <w:r>
+              <w:rPr>
+                <w:rFonts w:ascii="Calibri" w:hAnsi="Calibri"/>
+                <w:b/>
+                <w:color w:val="FFFFFF"/>
+                <w:sz w:val="18"/>
+              </w:rPr>
               <w:t xml:space="preserve">Port</w:t>
             </w:r>
           </w:p>
         </w:tc>
         <w:tc>
-          <w:tcPr/>
+          <w:tcPr>
+            <w:tcMar>
+              <w:top w:w="40" w:type="dxa"/>
+              <w:bottom w:w="40" w:type="dxa"/>
+              <w:left w:w="60" w:type="dxa"/>
+              <w:right w:w="60" w:type="dxa"/>
+            </w:tcMar>
+            <w:shd w:fill="1A365D" w:val="clear"/>
+            <w:tcMar>
+              <w:top w:w="40" w:type="dxa"/>
+              <w:bottom w:w="40" w:type="dxa"/>
+              <w:left w:w="60" w:type="dxa"/>
+              <w:right w:w="60" w:type="dxa"/>
+            </w:tcMar>
+          </w:tcPr>
           <w:p>
             <w:pPr>
               <w:pStyle w:val="Compact"/>
+              <w:spacing w:before="0" w:after="40" w:line="264" w:lineRule="auto"/>
               <w:jc w:val="left"/>
             </w:pPr>
             <w:r>
+              <w:rPr>
+                <w:rFonts w:ascii="Calibri" w:hAnsi="Calibri"/>
+                <w:b/>
+                <w:color w:val="FFFFFF"/>
+                <w:sz w:val="18"/>
+              </w:rPr>
               <w:t xml:space="preserve">Notes</w:t>
             </w:r>
           </w:p>
@@ -1198,92 +1679,200 @@
       </w:tr>
       <w:tr>
         <w:tc>
-          <w:tcPr/>
+          <w:tcPr>
+            <w:tcMar>
+              <w:top w:w="40" w:type="dxa"/>
+              <w:bottom w:w="40" w:type="dxa"/>
+              <w:left w:w="60" w:type="dxa"/>
+              <w:right w:w="60" w:type="dxa"/>
+            </w:tcMar>
+            <w:tcMar>
+              <w:top w:w="40" w:type="dxa"/>
+              <w:bottom w:w="40" w:type="dxa"/>
+              <w:left w:w="60" w:type="dxa"/>
+              <w:right w:w="60" w:type="dxa"/>
+            </w:tcMar>
+          </w:tcPr>
           <w:p>
             <w:pPr>
               <w:pStyle w:val="Compact"/>
+              <w:spacing w:before="0" w:after="40" w:line="264" w:lineRule="auto"/>
               <w:jc w:val="left"/>
             </w:pPr>
             <w:r>
+              <w:rPr>
+                <w:rFonts w:ascii="Calibri" w:hAnsi="Calibri"/>
+                <w:sz w:val="18"/>
+              </w:rPr>
               <w:t xml:space="preserve">Open Liberty</w:t>
             </w:r>
             <w:r>
+              <w:rPr>
+                <w:rFonts w:ascii="Calibri" w:hAnsi="Calibri"/>
+                <w:sz w:val="18"/>
+              </w:rPr>
               <w:t xml:space="preserve"> </w:t>
             </w:r>
             <w:r>
+              <w:rPr>
+                <w:rFonts w:ascii="Calibri" w:hAnsi="Calibri"/>
+                <w:sz w:val="18"/>
+              </w:rPr>
               <w:t xml:space="preserve">(primary)</w:t>
             </w:r>
           </w:p>
         </w:tc>
         <w:tc>
-          <w:tcPr/>
+          <w:tcPr>
+            <w:tcMar>
+              <w:top w:w="40" w:type="dxa"/>
+              <w:bottom w:w="40" w:type="dxa"/>
+              <w:left w:w="60" w:type="dxa"/>
+              <w:right w:w="60" w:type="dxa"/>
+            </w:tcMar>
+            <w:tcMar>
+              <w:top w:w="40" w:type="dxa"/>
+              <w:bottom w:w="40" w:type="dxa"/>
+              <w:left w:w="60" w:type="dxa"/>
+              <w:right w:w="60" w:type="dxa"/>
+            </w:tcMar>
+          </w:tcPr>
           <w:p>
             <w:pPr>
               <w:pStyle w:val="Compact"/>
+              <w:spacing w:before="0" w:after="40" w:line="264" w:lineRule="auto"/>
               <w:jc w:val="left"/>
             </w:pPr>
             <w:r>
+              <w:rPr>
+                <w:rFonts w:ascii="Calibri" w:hAnsi="Calibri"/>
+                <w:sz w:val="18"/>
+              </w:rPr>
               <w:t xml:space="preserve">9080 HTTP / 9443</w:t>
             </w:r>
             <w:r>
+              <w:rPr>
+                <w:rFonts w:ascii="Calibri" w:hAnsi="Calibri"/>
+                <w:sz w:val="18"/>
+              </w:rPr>
               <w:t xml:space="preserve"> </w:t>
             </w:r>
             <w:r>
+              <w:rPr>
+                <w:rFonts w:ascii="Calibri" w:hAnsi="Calibri"/>
+                <w:sz w:val="18"/>
+              </w:rPr>
               <w:t xml:space="preserve">HTTPS</w:t>
             </w:r>
           </w:p>
         </w:tc>
         <w:tc>
-          <w:tcPr/>
+          <w:tcPr>
+            <w:tcMar>
+              <w:top w:w="40" w:type="dxa"/>
+              <w:bottom w:w="40" w:type="dxa"/>
+              <w:left w:w="60" w:type="dxa"/>
+              <w:right w:w="60" w:type="dxa"/>
+            </w:tcMar>
+            <w:tcMar>
+              <w:top w:w="40" w:type="dxa"/>
+              <w:bottom w:w="40" w:type="dxa"/>
+              <w:left w:w="60" w:type="dxa"/>
+              <w:right w:w="60" w:type="dxa"/>
+            </w:tcMar>
+          </w:tcPr>
           <w:p>
             <w:pPr>
               <w:pStyle w:val="Compact"/>
+              <w:spacing w:before="0" w:after="40" w:line="264" w:lineRule="auto"/>
               <w:jc w:val="left"/>
             </w:pPr>
             <w:r>
               <w:rPr>
                 <w:rStyle w:val="VerbatimChar"/>
+                <w:rFonts w:ascii="Calibri" w:hAnsi="Calibri"/>
+                <w:sz w:val="18"/>
               </w:rPr>
               <w:t xml:space="preserve">scripts/redeploy-liberty.sh</w:t>
             </w:r>
             <w:r>
-              <w:t xml:space="preserve"> </w:t>
-            </w:r>
-            <w:r>
-              <w:t xml:space="preserve">JDWP debug</w:t>
-            </w:r>
-            <w:r>
+              <w:rPr>
+                <w:rFonts w:ascii="Calibri" w:hAnsi="Calibri"/>
+                <w:sz w:val="18"/>
+              </w:rPr>
               <w:t xml:space="preserve"> </w:t>
             </w:r>
             <w:r>
               <w:rPr>
+                <w:rFonts w:ascii="Calibri" w:hAnsi="Calibri"/>
+                <w:sz w:val="18"/>
+              </w:rPr>
+              <w:t xml:space="preserve">JDWP debug</w:t>
+            </w:r>
+            <w:r>
+              <w:rPr>
+                <w:rFonts w:ascii="Calibri" w:hAnsi="Calibri"/>
+                <w:sz w:val="18"/>
+              </w:rPr>
+              <w:t xml:space="preserve"> </w:t>
+            </w:r>
+            <w:r>
+              <w:rPr>
+                <w:rFonts w:ascii="Calibri" w:hAnsi="Calibri"/>
                 <w:b/>
                 <w:bCs/>
+                <w:sz w:val="18"/>
               </w:rPr>
               <w:t xml:space="preserve">7777</w:t>
             </w:r>
             <w:r>
+              <w:rPr>
+                <w:rFonts w:ascii="Calibri" w:hAnsi="Calibri"/>
+                <w:sz w:val="18"/>
+              </w:rPr>
               <w:t xml:space="preserve"> </w:t>
             </w:r>
             <w:r>
+              <w:rPr>
+                <w:rFonts w:ascii="Calibri" w:hAnsi="Calibri"/>
+                <w:sz w:val="18"/>
+              </w:rPr>
               <w:t xml:space="preserve">by default</w:t>
             </w:r>
             <w:r>
+              <w:rPr>
+                <w:rFonts w:ascii="Calibri" w:hAnsi="Calibri"/>
+                <w:sz w:val="18"/>
+              </w:rPr>
               <w:t xml:space="preserve"> </w:t>
             </w:r>
             <w:r>
+              <w:rPr>
+                <w:rFonts w:ascii="Calibri" w:hAnsi="Calibri"/>
+                <w:sz w:val="18"/>
+              </w:rPr>
               <w:t xml:space="preserve">(</w:t>
             </w:r>
             <w:r>
               <w:rPr>
                 <w:rStyle w:val="VerbatimChar"/>
+                <w:rFonts w:ascii="Calibri" w:hAnsi="Calibri"/>
+                <w:sz w:val="18"/>
               </w:rPr>
               <w:t xml:space="preserve">LIBERTY_DEBUG=0</w:t>
             </w:r>
             <w:r>
+              <w:rPr>
+                <w:rFonts w:ascii="Calibri" w:hAnsi="Calibri"/>
+                <w:sz w:val="18"/>
+              </w:rPr>
               <w:t xml:space="preserve"> </w:t>
             </w:r>
             <w:r>
+              <w:rPr>
+                <w:rFonts w:ascii="Calibri" w:hAnsi="Calibri"/>
+                <w:sz w:val="18"/>
+              </w:rPr>
               <w:t xml:space="preserve">to disable)</w:t>
             </w:r>
           </w:p>
@@ -1291,39 +1880,91 @@
       </w:tr>
       <w:tr>
         <w:tc>
-          <w:tcPr/>
+          <w:tcPr>
+            <w:tcMar>
+              <w:top w:w="40" w:type="dxa"/>
+              <w:bottom w:w="40" w:type="dxa"/>
+              <w:left w:w="60" w:type="dxa"/>
+              <w:right w:w="60" w:type="dxa"/>
+            </w:tcMar>
+            <w:tcMar>
+              <w:top w:w="40" w:type="dxa"/>
+              <w:bottom w:w="40" w:type="dxa"/>
+              <w:left w:w="60" w:type="dxa"/>
+              <w:right w:w="60" w:type="dxa"/>
+            </w:tcMar>
+          </w:tcPr>
           <w:p>
             <w:pPr>
               <w:pStyle w:val="Compact"/>
+              <w:spacing w:before="0" w:after="40" w:line="264" w:lineRule="auto"/>
               <w:jc w:val="left"/>
             </w:pPr>
             <w:r>
+              <w:rPr>
+                <w:rFonts w:ascii="Calibri" w:hAnsi="Calibri"/>
+                <w:sz w:val="18"/>
+              </w:rPr>
               <w:t xml:space="preserve">Kafka (local)</w:t>
             </w:r>
           </w:p>
         </w:tc>
         <w:tc>
-          <w:tcPr/>
+          <w:tcPr>
+            <w:tcMar>
+              <w:top w:w="40" w:type="dxa"/>
+              <w:bottom w:w="40" w:type="dxa"/>
+              <w:left w:w="60" w:type="dxa"/>
+              <w:right w:w="60" w:type="dxa"/>
+            </w:tcMar>
+            <w:tcMar>
+              <w:top w:w="40" w:type="dxa"/>
+              <w:bottom w:w="40" w:type="dxa"/>
+              <w:left w:w="60" w:type="dxa"/>
+              <w:right w:w="60" w:type="dxa"/>
+            </w:tcMar>
+          </w:tcPr>
           <w:p>
             <w:pPr>
               <w:pStyle w:val="Compact"/>
+              <w:spacing w:before="0" w:after="40" w:line="264" w:lineRule="auto"/>
               <w:jc w:val="left"/>
             </w:pPr>
             <w:r>
+              <w:rPr>
+                <w:rFonts w:ascii="Calibri" w:hAnsi="Calibri"/>
+                <w:sz w:val="18"/>
+              </w:rPr>
               <w:t xml:space="preserve">9092</w:t>
             </w:r>
           </w:p>
         </w:tc>
         <w:tc>
-          <w:tcPr/>
+          <w:tcPr>
+            <w:tcMar>
+              <w:top w:w="40" w:type="dxa"/>
+              <w:bottom w:w="40" w:type="dxa"/>
+              <w:left w:w="60" w:type="dxa"/>
+              <w:right w:w="60" w:type="dxa"/>
+            </w:tcMar>
+            <w:tcMar>
+              <w:top w:w="40" w:type="dxa"/>
+              <w:bottom w:w="40" w:type="dxa"/>
+              <w:left w:w="60" w:type="dxa"/>
+              <w:right w:w="60" w:type="dxa"/>
+            </w:tcMar>
+          </w:tcPr>
           <w:p>
             <w:pPr>
               <w:pStyle w:val="Compact"/>
+              <w:spacing w:before="0" w:after="40" w:line="264" w:lineRule="auto"/>
               <w:jc w:val="left"/>
             </w:pPr>
             <w:r>
               <w:rPr>
                 <w:rStyle w:val="VerbatimChar"/>
+                <w:rFonts w:ascii="Calibri" w:hAnsi="Calibri"/>
+                <w:sz w:val="18"/>
               </w:rPr>
               <w:t xml:space="preserve">docker compose up -d kafka</w:t>
             </w:r>
@@ -1332,39 +1973,212 @@
       </w:tr>
       <w:tr>
         <w:tc>
-          <w:tcPr/>
+          <w:tcPr>
+            <w:tcMar>
+              <w:top w:w="40" w:type="dxa"/>
+              <w:bottom w:w="40" w:type="dxa"/>
+              <w:left w:w="60" w:type="dxa"/>
+              <w:right w:w="60" w:type="dxa"/>
+            </w:tcMar>
+            <w:tcMar>
+              <w:top w:w="40" w:type="dxa"/>
+              <w:bottom w:w="40" w:type="dxa"/>
+              <w:left w:w="60" w:type="dxa"/>
+              <w:right w:w="60" w:type="dxa"/>
+            </w:tcMar>
+          </w:tcPr>
           <w:p>
             <w:pPr>
               <w:pStyle w:val="Compact"/>
+              <w:spacing w:before="0" w:after="40" w:line="264" w:lineRule="auto"/>
               <w:jc w:val="left"/>
             </w:pPr>
             <w:r>
+              <w:rPr>
+                <w:rFonts w:ascii="Calibri" w:hAnsi="Calibri"/>
+                <w:sz w:val="18"/>
+              </w:rPr>
+              <w:t xml:space="preserve">Redis (local)</w:t>
+            </w:r>
+          </w:p>
+        </w:tc>
+        <w:tc>
+          <w:tcPr>
+            <w:tcMar>
+              <w:top w:w="40" w:type="dxa"/>
+              <w:bottom w:w="40" w:type="dxa"/>
+              <w:left w:w="60" w:type="dxa"/>
+              <w:right w:w="60" w:type="dxa"/>
+            </w:tcMar>
+            <w:tcMar>
+              <w:top w:w="40" w:type="dxa"/>
+              <w:bottom w:w="40" w:type="dxa"/>
+              <w:left w:w="60" w:type="dxa"/>
+              <w:right w:w="60" w:type="dxa"/>
+            </w:tcMar>
+          </w:tcPr>
+          <w:p>
+            <w:pPr>
+              <w:pStyle w:val="Compact"/>
+              <w:spacing w:before="0" w:after="40" w:line="264" w:lineRule="auto"/>
+              <w:jc w:val="left"/>
+            </w:pPr>
+            <w:r>
+              <w:rPr>
+                <w:rFonts w:ascii="Calibri" w:hAnsi="Calibri"/>
+                <w:sz w:val="18"/>
+              </w:rPr>
+              <w:t xml:space="preserve">6379</w:t>
+            </w:r>
+          </w:p>
+        </w:tc>
+        <w:tc>
+          <w:tcPr>
+            <w:tcMar>
+              <w:top w:w="40" w:type="dxa"/>
+              <w:bottom w:w="40" w:type="dxa"/>
+              <w:left w:w="60" w:type="dxa"/>
+              <w:right w:w="60" w:type="dxa"/>
+            </w:tcMar>
+            <w:tcMar>
+              <w:top w:w="40" w:type="dxa"/>
+              <w:bottom w:w="40" w:type="dxa"/>
+              <w:left w:w="60" w:type="dxa"/>
+              <w:right w:w="60" w:type="dxa"/>
+            </w:tcMar>
+          </w:tcPr>
+          <w:p>
+            <w:pPr>
+              <w:pStyle w:val="Compact"/>
+              <w:spacing w:before="0" w:after="40" w:line="264" w:lineRule="auto"/>
+              <w:jc w:val="left"/>
+            </w:pPr>
+            <w:r>
+              <w:rPr>
+                <w:rStyle w:val="VerbatimChar"/>
+                <w:rFonts w:ascii="Calibri" w:hAnsi="Calibri"/>
+                <w:sz w:val="18"/>
+              </w:rPr>
+              <w:t xml:space="preserve">docker compose</w:t>
+            </w:r>
+            <w:r>
+              <w:rPr>
+                <w:rFonts w:ascii="Calibri" w:hAnsi="Calibri"/>
+                <w:sz w:val="18"/>
+              </w:rPr>
+              <w:t xml:space="preserve"> </w:t>
+            </w:r>
+            <w:r>
+              <w:rPr>
+                <w:rFonts w:ascii="Calibri" w:hAnsi="Calibri"/>
+                <w:sz w:val="18"/>
+              </w:rPr>
+              <w:t xml:space="preserve">Redis;</w:t>
+            </w:r>
+            <w:r>
+              <w:rPr>
+                <w:rFonts w:ascii="Calibri" w:hAnsi="Calibri"/>
+                <w:sz w:val="18"/>
+              </w:rPr>
+              <w:t xml:space="preserve"> </w:t>
+            </w:r>
+            <w:r>
+              <w:rPr>
+                <w:rFonts w:ascii="Calibri" w:hAnsi="Calibri"/>
+                <w:sz w:val="18"/>
+              </w:rPr>
+              <w:t xml:space="preserve">entity cache + rate limit</w:t>
+            </w:r>
+          </w:p>
+        </w:tc>
+      </w:tr>
+      <w:tr>
+        <w:tc>
+          <w:tcPr>
+            <w:tcMar>
+              <w:top w:w="40" w:type="dxa"/>
+              <w:bottom w:w="40" w:type="dxa"/>
+              <w:left w:w="60" w:type="dxa"/>
+              <w:right w:w="60" w:type="dxa"/>
+            </w:tcMar>
+            <w:tcMar>
+              <w:top w:w="40" w:type="dxa"/>
+              <w:bottom w:w="40" w:type="dxa"/>
+              <w:left w:w="60" w:type="dxa"/>
+              <w:right w:w="60" w:type="dxa"/>
+            </w:tcMar>
+          </w:tcPr>
+          <w:p>
+            <w:pPr>
+              <w:pStyle w:val="Compact"/>
+              <w:spacing w:before="0" w:after="40" w:line="264" w:lineRule="auto"/>
+              <w:jc w:val="left"/>
+            </w:pPr>
+            <w:r>
+              <w:rPr>
+                <w:rFonts w:ascii="Calibri" w:hAnsi="Calibri"/>
+                <w:sz w:val="18"/>
+              </w:rPr>
               <w:t xml:space="preserve">Mailpit (local)</w:t>
             </w:r>
           </w:p>
         </w:tc>
         <w:tc>
-          <w:tcPr/>
+          <w:tcPr>
+            <w:tcMar>
+              <w:top w:w="40" w:type="dxa"/>
+              <w:bottom w:w="40" w:type="dxa"/>
+              <w:left w:w="60" w:type="dxa"/>
+              <w:right w:w="60" w:type="dxa"/>
+            </w:tcMar>
+            <w:tcMar>
+              <w:top w:w="40" w:type="dxa"/>
+              <w:bottom w:w="40" w:type="dxa"/>
+              <w:left w:w="60" w:type="dxa"/>
+              <w:right w:w="60" w:type="dxa"/>
+            </w:tcMar>
+          </w:tcPr>
           <w:p>
             <w:pPr>
               <w:pStyle w:val="Compact"/>
+              <w:spacing w:before="0" w:after="40" w:line="264" w:lineRule="auto"/>
               <w:jc w:val="left"/>
             </w:pPr>
             <w:r>
+              <w:rPr>
+                <w:rFonts w:ascii="Calibri" w:hAnsi="Calibri"/>
+                <w:sz w:val="18"/>
+              </w:rPr>
               <w:t xml:space="preserve">SMTP 1025 / UI 8025</w:t>
             </w:r>
           </w:p>
         </w:tc>
         <w:tc>
-          <w:tcPr/>
+          <w:tcPr>
+            <w:tcMar>
+              <w:top w:w="40" w:type="dxa"/>
+              <w:bottom w:w="40" w:type="dxa"/>
+              <w:left w:w="60" w:type="dxa"/>
+              <w:right w:w="60" w:type="dxa"/>
+            </w:tcMar>
+            <w:tcMar>
+              <w:top w:w="40" w:type="dxa"/>
+              <w:bottom w:w="40" w:type="dxa"/>
+              <w:left w:w="60" w:type="dxa"/>
+              <w:right w:w="60" w:type="dxa"/>
+            </w:tcMar>
+          </w:tcPr>
           <w:p>
             <w:pPr>
               <w:pStyle w:val="Compact"/>
+              <w:spacing w:before="0" w:after="40" w:line="264" w:lineRule="auto"/>
               <w:jc w:val="left"/>
             </w:pPr>
             <w:r>
               <w:rPr>
                 <w:rStyle w:val="VerbatimChar"/>
+                <w:rFonts w:ascii="Calibri" w:hAnsi="Calibri"/>
+                <w:sz w:val="18"/>
               </w:rPr>
               <w:t xml:space="preserve">docker compose up -d mailpit</w:t>
             </w:r>
@@ -1373,48 +2187,106 @@
       </w:tr>
       <w:tr>
         <w:tc>
-          <w:tcPr/>
+          <w:tcPr>
+            <w:tcMar>
+              <w:top w:w="40" w:type="dxa"/>
+              <w:bottom w:w="40" w:type="dxa"/>
+              <w:left w:w="60" w:type="dxa"/>
+              <w:right w:w="60" w:type="dxa"/>
+            </w:tcMar>
+            <w:tcMar>
+              <w:top w:w="40" w:type="dxa"/>
+              <w:bottom w:w="40" w:type="dxa"/>
+              <w:left w:w="60" w:type="dxa"/>
+              <w:right w:w="60" w:type="dxa"/>
+            </w:tcMar>
+          </w:tcPr>
           <w:p>
             <w:pPr>
               <w:pStyle w:val="Compact"/>
+              <w:spacing w:before="0" w:after="40" w:line="264" w:lineRule="auto"/>
               <w:jc w:val="left"/>
             </w:pPr>
             <w:r>
+              <w:rPr>
+                <w:rFonts w:ascii="Calibri" w:hAnsi="Calibri"/>
+                <w:sz w:val="18"/>
+              </w:rPr>
               <w:t xml:space="preserve">Embedded Tomcat</w:t>
             </w:r>
           </w:p>
         </w:tc>
         <w:tc>
-          <w:tcPr/>
+          <w:tcPr>
+            <w:tcMar>
+              <w:top w:w="40" w:type="dxa"/>
+              <w:bottom w:w="40" w:type="dxa"/>
+              <w:left w:w="60" w:type="dxa"/>
+              <w:right w:w="60" w:type="dxa"/>
+            </w:tcMar>
+            <w:tcMar>
+              <w:top w:w="40" w:type="dxa"/>
+              <w:bottom w:w="40" w:type="dxa"/>
+              <w:left w:w="60" w:type="dxa"/>
+              <w:right w:w="60" w:type="dxa"/>
+            </w:tcMar>
+          </w:tcPr>
           <w:p>
             <w:pPr>
               <w:pStyle w:val="Compact"/>
+              <w:spacing w:before="0" w:after="40" w:line="264" w:lineRule="auto"/>
               <w:jc w:val="left"/>
             </w:pPr>
             <w:r>
+              <w:rPr>
+                <w:rFonts w:ascii="Calibri" w:hAnsi="Calibri"/>
+                <w:sz w:val="18"/>
+              </w:rPr>
               <w:t xml:space="preserve">8080</w:t>
             </w:r>
           </w:p>
         </w:tc>
         <w:tc>
-          <w:tcPr/>
+          <w:tcPr>
+            <w:tcMar>
+              <w:top w:w="40" w:type="dxa"/>
+              <w:bottom w:w="40" w:type="dxa"/>
+              <w:left w:w="60" w:type="dxa"/>
+              <w:right w:w="60" w:type="dxa"/>
+            </w:tcMar>
+            <w:tcMar>
+              <w:top w:w="40" w:type="dxa"/>
+              <w:bottom w:w="40" w:type="dxa"/>
+              <w:left w:w="60" w:type="dxa"/>
+              <w:right w:w="60" w:type="dxa"/>
+            </w:tcMar>
+          </w:tcPr>
           <w:p>
             <w:pPr>
               <w:pStyle w:val="Compact"/>
+              <w:spacing w:before="0" w:after="40" w:line="264" w:lineRule="auto"/>
               <w:jc w:val="left"/>
             </w:pPr>
             <w:r>
               <w:rPr>
                 <w:rStyle w:val="VerbatimChar"/>
+                <w:rFonts w:ascii="Calibri" w:hAnsi="Calibri"/>
+                <w:sz w:val="18"/>
               </w:rPr>
               <w:t xml:space="preserve">application.properties</w:t>
             </w:r>
             <w:r>
+              <w:rPr>
+                <w:rFonts w:ascii="Calibri" w:hAnsi="Calibri"/>
+                <w:sz w:val="18"/>
+              </w:rPr>
               <w:t xml:space="preserve"> </w:t>
             </w:r>
             <w:r>
               <w:rPr>
                 <w:rStyle w:val="VerbatimChar"/>
+                <w:rFonts w:ascii="Calibri" w:hAnsi="Calibri"/>
+                <w:sz w:val="18"/>
               </w:rPr>
               <w:t xml:space="preserve">server.port</w:t>
             </w:r>
@@ -1423,45 +2295,105 @@
       </w:tr>
       <w:tr>
         <w:tc>
-          <w:tcPr/>
+          <w:tcPr>
+            <w:tcMar>
+              <w:top w:w="40" w:type="dxa"/>
+              <w:bottom w:w="40" w:type="dxa"/>
+              <w:left w:w="60" w:type="dxa"/>
+              <w:right w:w="60" w:type="dxa"/>
+            </w:tcMar>
+            <w:tcMar>
+              <w:top w:w="40" w:type="dxa"/>
+              <w:bottom w:w="40" w:type="dxa"/>
+              <w:left w:w="60" w:type="dxa"/>
+              <w:right w:w="60" w:type="dxa"/>
+            </w:tcMar>
+          </w:tcPr>
           <w:p>
             <w:pPr>
               <w:pStyle w:val="Compact"/>
+              <w:spacing w:before="0" w:after="40" w:line="264" w:lineRule="auto"/>
               <w:jc w:val="left"/>
             </w:pPr>
             <w:r>
+              <w:rPr>
+                <w:rFonts w:ascii="Calibri" w:hAnsi="Calibri"/>
+                <w:sz w:val="18"/>
+              </w:rPr>
               <w:t xml:space="preserve">Angular</w:t>
             </w:r>
           </w:p>
         </w:tc>
         <w:tc>
-          <w:tcPr/>
+          <w:tcPr>
+            <w:tcMar>
+              <w:top w:w="40" w:type="dxa"/>
+              <w:bottom w:w="40" w:type="dxa"/>
+              <w:left w:w="60" w:type="dxa"/>
+              <w:right w:w="60" w:type="dxa"/>
+            </w:tcMar>
+            <w:tcMar>
+              <w:top w:w="40" w:type="dxa"/>
+              <w:bottom w:w="40" w:type="dxa"/>
+              <w:left w:w="60" w:type="dxa"/>
+              <w:right w:w="60" w:type="dxa"/>
+            </w:tcMar>
+          </w:tcPr>
           <w:p>
             <w:pPr>
               <w:pStyle w:val="Compact"/>
+              <w:spacing w:before="0" w:after="40" w:line="264" w:lineRule="auto"/>
               <w:jc w:val="left"/>
             </w:pPr>
             <w:r>
+              <w:rPr>
+                <w:rFonts w:ascii="Calibri" w:hAnsi="Calibri"/>
+                <w:sz w:val="18"/>
+              </w:rPr>
               <w:t xml:space="preserve">4200</w:t>
             </w:r>
           </w:p>
         </w:tc>
         <w:tc>
-          <w:tcPr/>
+          <w:tcPr>
+            <w:tcMar>
+              <w:top w:w="40" w:type="dxa"/>
+              <w:bottom w:w="40" w:type="dxa"/>
+              <w:left w:w="60" w:type="dxa"/>
+              <w:right w:w="60" w:type="dxa"/>
+            </w:tcMar>
+            <w:tcMar>
+              <w:top w:w="40" w:type="dxa"/>
+              <w:bottom w:w="40" w:type="dxa"/>
+              <w:left w:w="60" w:type="dxa"/>
+              <w:right w:w="60" w:type="dxa"/>
+            </w:tcMar>
+          </w:tcPr>
           <w:p>
             <w:pPr>
               <w:pStyle w:val="Compact"/>
+              <w:spacing w:before="0" w:after="40" w:line="264" w:lineRule="auto"/>
               <w:jc w:val="left"/>
             </w:pPr>
             <w:r>
+              <w:rPr>
+                <w:rFonts w:ascii="Calibri" w:hAnsi="Calibri"/>
+                <w:sz w:val="18"/>
+              </w:rPr>
               <w:t xml:space="preserve">Talks to API base in</w:t>
             </w:r>
             <w:r>
+              <w:rPr>
+                <w:rFonts w:ascii="Calibri" w:hAnsi="Calibri"/>
+                <w:sz w:val="18"/>
+              </w:rPr>
               <w:t xml:space="preserve"> </w:t>
             </w:r>
             <w:r>
               <w:rPr>
                 <w:rStyle w:val="VerbatimChar"/>
+                <w:rFonts w:ascii="Calibri" w:hAnsi="Calibri"/>
+                <w:sz w:val="18"/>
               </w:rPr>
               <w:t xml:space="preserve">api-config.ts</w:t>
             </w:r>
@@ -1518,6 +2450,8 @@
           <w:ilvl w:val="0"/>
           <w:numId w:val="1002"/>
         </w:numPr>
+        <w:spacing w:after="160" w:line="276" w:lineRule="auto"/>
+        <w:jc w:val="left"/>
       </w:pPr>
       <w:r>
         <w:t xml:space="preserve">Stateless JWT (</w:t>
@@ -1539,6 +2473,8 @@
           <w:ilvl w:val="0"/>
           <w:numId w:val="1002"/>
         </w:numPr>
+        <w:spacing w:after="160" w:line="276" w:lineRule="auto"/>
+        <w:jc w:val="left"/>
       </w:pPr>
       <w:r>
         <w:t xml:space="preserve">Login public; all other endpoints authenticated</w:t>
@@ -1551,6 +2487,8 @@
           <w:ilvl w:val="0"/>
           <w:numId w:val="1002"/>
         </w:numPr>
+        <w:spacing w:after="160" w:line="276" w:lineRule="auto"/>
+        <w:jc w:val="left"/>
       </w:pPr>
       <w:r>
         <w:t xml:space="preserve">Role checks via</w:t>
@@ -1599,6 +2537,8 @@
           <w:ilvl w:val="0"/>
           <w:numId w:val="1002"/>
         </w:numPr>
+        <w:spacing w:after="160" w:line="276" w:lineRule="auto"/>
+        <w:jc w:val="left"/>
       </w:pPr>
       <w:r>
         <w:t xml:space="preserve">Roles loaded from DB on each request (</w:t>
@@ -1641,7 +2581,23 @@
         <w:t xml:space="preserve"> </w:t>
       </w:r>
       <w:r>
-        <w:t xml:space="preserve">embedded in JWT claims</w:t>
+        <w:t xml:space="preserve">embedded in JWT claims (auth path is</w:t>
+      </w:r>
+      <w:r>
+        <w:t xml:space="preserve"> </w:t>
+      </w:r>
+      <w:r>
+        <w:rPr>
+          <w:b/>
+          <w:bCs/>
+        </w:rPr>
+        <w:t xml:space="preserve">not</w:t>
+      </w:r>
+      <w:r>
+        <w:t xml:space="preserve"> </w:t>
+      </w:r>
+      <w:r>
+        <w:t xml:space="preserve">Redis-cached)</w:t>
       </w:r>
     </w:p>
     <w:p>
@@ -1651,6 +2607,8 @@
           <w:ilvl w:val="0"/>
           <w:numId w:val="1002"/>
         </w:numPr>
+        <w:spacing w:after="160" w:line="276" w:lineRule="auto"/>
+        <w:jc w:val="left"/>
       </w:pPr>
       <w:r>
         <w:t xml:space="preserve">Account lockout via</w:t>
@@ -1669,6 +2627,32 @@
       </w:r>
       <w:r>
         <w:t xml:space="preserve">/ user lock fields</w:t>
+      </w:r>
+    </w:p>
+    <w:p>
+      <w:pPr>
+        <w:pStyle w:val="Compact"/>
+        <w:numPr>
+          <w:ilvl w:val="0"/>
+          <w:numId w:val="1002"/>
+        </w:numPr>
+        <w:spacing w:after="160" w:line="276" w:lineRule="auto"/>
+        <w:jc w:val="left"/>
+      </w:pPr>
+      <w:r>
+        <w:t xml:space="preserve">Optional Redis rate limit on login/API (local;</w:t>
+      </w:r>
+      <w:r>
+        <w:t xml:space="preserve"> </w:t>
+      </w:r>
+      <w:r>
+        <w:rPr>
+          <w:rStyle w:val="VerbatimChar"/>
+        </w:rPr>
+        <w:t xml:space="preserve">app.rate-limit.redis-enabled</w:t>
+      </w:r>
+      <w:r>
+        <w:t xml:space="preserve">)</w:t>
       </w:r>
     </w:p>
     <w:bookmarkEnd w:id="16"/>
@@ -1688,6 +2672,8 @@
           <w:ilvl w:val="0"/>
           <w:numId w:val="1003"/>
         </w:numPr>
+        <w:spacing w:after="160" w:line="276" w:lineRule="auto"/>
+        <w:jc w:val="left"/>
       </w:pPr>
       <w:r>
         <w:t xml:space="preserve">Schema evolution: Hibernate</w:t>
@@ -1709,6 +2695,8 @@
           <w:ilvl w:val="0"/>
           <w:numId w:val="1003"/>
         </w:numPr>
+        <w:spacing w:after="160" w:line="276" w:lineRule="auto"/>
+        <w:jc w:val="left"/>
       </w:pPr>
       <w:r>
         <w:t xml:space="preserve">Explicit SQL:</w:t>
@@ -1751,6 +2739,8 @@
           <w:ilvl w:val="0"/>
           <w:numId w:val="1003"/>
         </w:numPr>
+        <w:spacing w:after="160" w:line="276" w:lineRule="auto"/>
+        <w:jc w:val="left"/>
       </w:pPr>
       <w:r>
         <w:t xml:space="preserve">Soft business IDs:</w:t>
@@ -1784,6 +2774,107 @@
       </w:r>
       <w:r>
         <w:t xml:space="preserve">), not a DB column</w:t>
+      </w:r>
+    </w:p>
+    <w:p>
+      <w:pPr>
+        <w:pStyle w:val="Compact"/>
+        <w:numPr>
+          <w:ilvl w:val="0"/>
+          <w:numId w:val="1003"/>
+        </w:numPr>
+        <w:spacing w:after="160" w:line="276" w:lineRule="auto"/>
+        <w:jc w:val="left"/>
+      </w:pPr>
+      <w:r>
+        <w:rPr>
+          <w:b/>
+          <w:bCs/>
+        </w:rPr>
+        <w:t xml:space="preserve">Cache-aside (local):</w:t>
+      </w:r>
+      <w:r>
+        <w:t xml:space="preserve"> </w:t>
+      </w:r>
+      <w:r>
+        <w:t xml:space="preserve">Spring Cache → Redis for major reads; evict</w:t>
+      </w:r>
+      <w:r>
+        <w:t xml:space="preserve"> </w:t>
+      </w:r>
+      <w:r>
+        <w:t xml:space="preserve">on writes. See</w:t>
+      </w:r>
+      <w:r>
+        <w:t xml:space="preserve"> </w:t>
+      </w:r>
+      <w:hyperlink r:id="rId9">
+        <w:r>
+          <w:rPr>
+            <w:rStyle w:val="Hyperlink"/>
+          </w:rPr>
+          <w:t xml:space="preserve">MODULES/Caching.md</w:t>
+        </w:r>
+      </w:hyperlink>
+      <w:r>
+        <w:t xml:space="preserve">.</w:t>
+      </w:r>
+    </w:p>
+    <w:p>
+      <w:pPr>
+        <w:pStyle w:val="Compact"/>
+        <w:numPr>
+          <w:ilvl w:val="0"/>
+          <w:numId w:val="1003"/>
+        </w:numPr>
+        <w:spacing w:after="160" w:line="276" w:lineRule="auto"/>
+        <w:jc w:val="left"/>
+      </w:pPr>
+      <w:r>
+        <w:rPr>
+          <w:b/>
+          <w:bCs/>
+        </w:rPr>
+        <w:t xml:space="preserve">Read replica lab (local):</w:t>
+      </w:r>
+      <w:r>
+        <w:t xml:space="preserve"> </w:t>
+      </w:r>
+      <w:r>
+        <w:t xml:space="preserve">writes →</w:t>
+      </w:r>
+      <w:r>
+        <w:t xml:space="preserve"> </w:t>
+      </w:r>
+      <w:r>
+        <w:rPr>
+          <w:rStyle w:val="VerbatimChar"/>
+        </w:rPr>
+        <w:t xml:space="preserve">bankone</w:t>
+      </w:r>
+      <w:r>
+        <w:t xml:space="preserve">, read-only txs →</w:t>
+      </w:r>
+      <w:r>
+        <w:t xml:space="preserve"> </w:t>
+      </w:r>
+      <w:r>
+        <w:rPr>
+          <w:rStyle w:val="VerbatimChar"/>
+        </w:rPr>
+        <w:t xml:space="preserve">bankone_read</w:t>
+      </w:r>
+      <w:r>
+        <w:t xml:space="preserve">; sync via scheduler /</w:t>
+      </w:r>
+      <w:r>
+        <w:t xml:space="preserve"> </w:t>
+      </w:r>
+      <w:r>
+        <w:rPr>
+          <w:rStyle w:val="VerbatimChar"/>
+        </w:rPr>
+        <w:t xml:space="preserve">POST /admin/replica/sync</w:t>
       </w:r>
     </w:p>
     <w:bookmarkEnd w:id="17"/>
@@ -1803,6 +2894,27 @@
           <w:ilvl w:val="0"/>
           <w:numId w:val="1004"/>
         </w:numPr>
+        <w:spacing w:after="160" w:line="276" w:lineRule="auto"/>
+        <w:jc w:val="left"/>
+      </w:pPr>
+      <w:hyperlink r:id="rId9">
+        <w:r>
+          <w:rPr>
+            <w:rStyle w:val="Hyperlink"/>
+          </w:rPr>
+          <w:t xml:space="preserve">MODULES/Caching.md</w:t>
+        </w:r>
+      </w:hyperlink>
+    </w:p>
+    <w:p>
+      <w:pPr>
+        <w:pStyle w:val="Compact"/>
+        <w:numPr>
+          <w:ilvl w:val="0"/>
+          <w:numId w:val="1004"/>
+        </w:numPr>
+        <w:spacing w:after="160" w:line="276" w:lineRule="auto"/>
+        <w:jc w:val="left"/>
       </w:pPr>
       <w:hyperlink r:id="rId18">
         <w:r>
@@ -1820,6 +2932,8 @@
           <w:ilvl w:val="0"/>
           <w:numId w:val="1004"/>
         </w:numPr>
+        <w:spacing w:after="160" w:line="276" w:lineRule="auto"/>
+        <w:jc w:val="left"/>
       </w:pPr>
       <w:hyperlink r:id="rId19">
         <w:r>
@@ -1837,6 +2951,8 @@
           <w:ilvl w:val="0"/>
           <w:numId w:val="1004"/>
         </w:numPr>
+        <w:spacing w:after="160" w:line="276" w:lineRule="auto"/>
+        <w:jc w:val="left"/>
       </w:pPr>
       <w:hyperlink r:id="rId20">
         <w:r>

</xml_diff>